<commit_message>
Update thesis with latest Session 2 edits (19:06 today)
Replaces the version captured in 5cd652d (internal dcterms:modified
2026-08-22T13:40Z) with the later Session 2 revision
(dcterms:modified 2026-08-22T17:06Z).

Co-Authored-By: Claude Opus 5 (1M context) <noreply@anthropic.com>
</commit_message>
<xml_diff>
--- a/docs/MAICEN_M10_Final_Thesis_Mark_Shane_Haines.docx
+++ b/docs/MAICEN_M10_Final_Thesis_Mark_Shane_Haines.docx
@@ -177,7 +177,7 @@
         <w:keepNext/>
         <w:spacing w:before="480" w:after="240"/>
       </w:pPr>
-      <w:bookmarkStart w:id="0" w:name="_Toc238305738"/>
+      <w:bookmarkStart w:id="0" w:name="_Toc238318127"/>
       <w:r>
         <w:rPr>
           <w:b/>
@@ -255,7 +255,7 @@
         <w:pageBreakBefore/>
         <w:spacing w:before="480" w:after="240"/>
       </w:pPr>
-      <w:bookmarkStart w:id="1" w:name="_Toc238305739"/>
+      <w:bookmarkStart w:id="1" w:name="_Toc238318128"/>
       <w:r>
         <w:rPr>
           <w:b/>
@@ -296,7 +296,7 @@
       <w:r>
         <w:fldChar w:fldCharType="separate"/>
       </w:r>
-      <w:hyperlink w:anchor="_Toc238305738" w:history="1">
+      <w:hyperlink w:anchor="_Toc238318127" w:history="1">
         <w:r>
           <w:rPr>
             <w:rStyle w:val="Hyperlink"/>
@@ -325,7 +325,7 @@
             <w:noProof/>
             <w:webHidden/>
           </w:rPr>
-          <w:instrText xml:space="preserve"> PAGEREF _Toc238305738 \h </w:instrText>
+          <w:instrText xml:space="preserve"> PAGEREF _Toc238318127 \h </w:instrText>
         </w:r>
         <w:r>
           <w:rPr>
@@ -371,7 +371,7 @@
           <w14:ligatures w14:val="standardContextual"/>
         </w:rPr>
       </w:pPr>
-      <w:hyperlink w:anchor="_Toc238305739" w:history="1">
+      <w:hyperlink w:anchor="_Toc238318128" w:history="1">
         <w:r>
           <w:rPr>
             <w:rStyle w:val="Hyperlink"/>
@@ -400,7 +400,7 @@
             <w:noProof/>
             <w:webHidden/>
           </w:rPr>
-          <w:instrText xml:space="preserve"> PAGEREF _Toc238305739 \h </w:instrText>
+          <w:instrText xml:space="preserve"> PAGEREF _Toc238318128 \h </w:instrText>
         </w:r>
         <w:r>
           <w:rPr>
@@ -446,7 +446,7 @@
           <w14:ligatures w14:val="standardContextual"/>
         </w:rPr>
       </w:pPr>
-      <w:hyperlink w:anchor="_Toc238305740" w:history="1">
+      <w:hyperlink w:anchor="_Toc238318129" w:history="1">
         <w:r>
           <w:rPr>
             <w:rStyle w:val="Hyperlink"/>
@@ -475,7 +475,7 @@
             <w:noProof/>
             <w:webHidden/>
           </w:rPr>
-          <w:instrText xml:space="preserve"> PAGEREF _Toc238305740 \h </w:instrText>
+          <w:instrText xml:space="preserve"> PAGEREF _Toc238318129 \h </w:instrText>
         </w:r>
         <w:r>
           <w:rPr>
@@ -521,7 +521,7 @@
           <w14:ligatures w14:val="standardContextual"/>
         </w:rPr>
       </w:pPr>
-      <w:hyperlink w:anchor="_Toc238305741" w:history="1">
+      <w:hyperlink w:anchor="_Toc238318130" w:history="1">
         <w:r>
           <w:rPr>
             <w:rStyle w:val="Hyperlink"/>
@@ -549,7 +549,7 @@
             <w:noProof/>
             <w:webHidden/>
           </w:rPr>
-          <w:instrText xml:space="preserve"> PAGEREF _Toc238305741 \h </w:instrText>
+          <w:instrText xml:space="preserve"> PAGEREF _Toc238318130 \h </w:instrText>
         </w:r>
         <w:r>
           <w:rPr>
@@ -595,7 +595,7 @@
           <w14:ligatures w14:val="standardContextual"/>
         </w:rPr>
       </w:pPr>
-      <w:hyperlink w:anchor="_Toc238305742" w:history="1">
+      <w:hyperlink w:anchor="_Toc238318131" w:history="1">
         <w:r>
           <w:rPr>
             <w:rStyle w:val="Hyperlink"/>
@@ -624,7 +624,7 @@
             <w:noProof/>
             <w:webHidden/>
           </w:rPr>
-          <w:instrText xml:space="preserve"> PAGEREF _Toc238305742 \h </w:instrText>
+          <w:instrText xml:space="preserve"> PAGEREF _Toc238318131 \h </w:instrText>
         </w:r>
         <w:r>
           <w:rPr>
@@ -670,7 +670,7 @@
           <w14:ligatures w14:val="standardContextual"/>
         </w:rPr>
       </w:pPr>
-      <w:hyperlink w:anchor="_Toc238305743" w:history="1">
+      <w:hyperlink w:anchor="_Toc238318132" w:history="1">
         <w:r>
           <w:rPr>
             <w:rStyle w:val="Hyperlink"/>
@@ -699,7 +699,7 @@
             <w:noProof/>
             <w:webHidden/>
           </w:rPr>
-          <w:instrText xml:space="preserve"> PAGEREF _Toc238305743 \h </w:instrText>
+          <w:instrText xml:space="preserve"> PAGEREF _Toc238318132 \h </w:instrText>
         </w:r>
         <w:r>
           <w:rPr>
@@ -745,7 +745,7 @@
           <w14:ligatures w14:val="standardContextual"/>
         </w:rPr>
       </w:pPr>
-      <w:hyperlink w:anchor="_Toc238305744" w:history="1">
+      <w:hyperlink w:anchor="_Toc238318133" w:history="1">
         <w:r>
           <w:rPr>
             <w:rStyle w:val="Hyperlink"/>
@@ -774,7 +774,7 @@
             <w:noProof/>
             <w:webHidden/>
           </w:rPr>
-          <w:instrText xml:space="preserve"> PAGEREF _Toc238305744 \h </w:instrText>
+          <w:instrText xml:space="preserve"> PAGEREF _Toc238318133 \h </w:instrText>
         </w:r>
         <w:r>
           <w:rPr>
@@ -820,7 +820,7 @@
           <w14:ligatures w14:val="standardContextual"/>
         </w:rPr>
       </w:pPr>
-      <w:hyperlink w:anchor="_Toc238305745" w:history="1">
+      <w:hyperlink w:anchor="_Toc238318134" w:history="1">
         <w:r>
           <w:rPr>
             <w:rStyle w:val="Hyperlink"/>
@@ -849,7 +849,7 @@
             <w:noProof/>
             <w:webHidden/>
           </w:rPr>
-          <w:instrText xml:space="preserve"> PAGEREF _Toc238305745 \h </w:instrText>
+          <w:instrText xml:space="preserve"> PAGEREF _Toc238318134 \h </w:instrText>
         </w:r>
         <w:r>
           <w:rPr>
@@ -895,7 +895,7 @@
           <w14:ligatures w14:val="standardContextual"/>
         </w:rPr>
       </w:pPr>
-      <w:hyperlink w:anchor="_Toc238305746" w:history="1">
+      <w:hyperlink w:anchor="_Toc238318135" w:history="1">
         <w:r>
           <w:rPr>
             <w:rStyle w:val="Hyperlink"/>
@@ -924,7 +924,7 @@
             <w:noProof/>
             <w:webHidden/>
           </w:rPr>
-          <w:instrText xml:space="preserve"> PAGEREF _Toc238305746 \h </w:instrText>
+          <w:instrText xml:space="preserve"> PAGEREF _Toc238318135 \h </w:instrText>
         </w:r>
         <w:r>
           <w:rPr>
@@ -970,7 +970,7 @@
           <w14:ligatures w14:val="standardContextual"/>
         </w:rPr>
       </w:pPr>
-      <w:hyperlink w:anchor="_Toc238305747" w:history="1">
+      <w:hyperlink w:anchor="_Toc238318136" w:history="1">
         <w:r>
           <w:rPr>
             <w:rStyle w:val="Hyperlink"/>
@@ -999,7 +999,7 @@
             <w:noProof/>
             <w:webHidden/>
           </w:rPr>
-          <w:instrText xml:space="preserve"> PAGEREF _Toc238305747 \h </w:instrText>
+          <w:instrText xml:space="preserve"> PAGEREF _Toc238318136 \h </w:instrText>
         </w:r>
         <w:r>
           <w:rPr>
@@ -1045,7 +1045,7 @@
           <w14:ligatures w14:val="standardContextual"/>
         </w:rPr>
       </w:pPr>
-      <w:hyperlink w:anchor="_Toc238305748" w:history="1">
+      <w:hyperlink w:anchor="_Toc238318137" w:history="1">
         <w:r>
           <w:rPr>
             <w:rStyle w:val="Hyperlink"/>
@@ -1074,7 +1074,7 @@
             <w:noProof/>
             <w:webHidden/>
           </w:rPr>
-          <w:instrText xml:space="preserve"> PAGEREF _Toc238305748 \h </w:instrText>
+          <w:instrText xml:space="preserve"> PAGEREF _Toc238318137 \h </w:instrText>
         </w:r>
         <w:r>
           <w:rPr>
@@ -1120,7 +1120,7 @@
           <w14:ligatures w14:val="standardContextual"/>
         </w:rPr>
       </w:pPr>
-      <w:hyperlink w:anchor="_Toc238305749" w:history="1">
+      <w:hyperlink w:anchor="_Toc238318138" w:history="1">
         <w:r>
           <w:rPr>
             <w:rStyle w:val="Hyperlink"/>
@@ -1149,7 +1149,7 @@
             <w:noProof/>
             <w:webHidden/>
           </w:rPr>
-          <w:instrText xml:space="preserve"> PAGEREF _Toc238305749 \h </w:instrText>
+          <w:instrText xml:space="preserve"> PAGEREF _Toc238318138 \h </w:instrText>
         </w:r>
         <w:r>
           <w:rPr>
@@ -1195,7 +1195,7 @@
           <w14:ligatures w14:val="standardContextual"/>
         </w:rPr>
       </w:pPr>
-      <w:hyperlink w:anchor="_Toc238305750" w:history="1">
+      <w:hyperlink w:anchor="_Toc238318139" w:history="1">
         <w:r>
           <w:rPr>
             <w:rStyle w:val="Hyperlink"/>
@@ -1224,7 +1224,7 @@
             <w:noProof/>
             <w:webHidden/>
           </w:rPr>
-          <w:instrText xml:space="preserve"> PAGEREF _Toc238305750 \h </w:instrText>
+          <w:instrText xml:space="preserve"> PAGEREF _Toc238318139 \h </w:instrText>
         </w:r>
         <w:r>
           <w:rPr>
@@ -1270,7 +1270,7 @@
           <w14:ligatures w14:val="standardContextual"/>
         </w:rPr>
       </w:pPr>
-      <w:hyperlink w:anchor="_Toc238305751" w:history="1">
+      <w:hyperlink w:anchor="_Toc238318140" w:history="1">
         <w:r>
           <w:rPr>
             <w:rStyle w:val="Hyperlink"/>
@@ -1299,7 +1299,7 @@
             <w:noProof/>
             <w:webHidden/>
           </w:rPr>
-          <w:instrText xml:space="preserve"> PAGEREF _Toc238305751 \h </w:instrText>
+          <w:instrText xml:space="preserve"> PAGEREF _Toc238318140 \h </w:instrText>
         </w:r>
         <w:r>
           <w:rPr>
@@ -1345,7 +1345,7 @@
           <w14:ligatures w14:val="standardContextual"/>
         </w:rPr>
       </w:pPr>
-      <w:hyperlink w:anchor="_Toc238305752" w:history="1">
+      <w:hyperlink w:anchor="_Toc238318141" w:history="1">
         <w:r>
           <w:rPr>
             <w:rStyle w:val="Hyperlink"/>
@@ -1374,7 +1374,7 @@
             <w:noProof/>
             <w:webHidden/>
           </w:rPr>
-          <w:instrText xml:space="preserve"> PAGEREF _Toc238305752 \h </w:instrText>
+          <w:instrText xml:space="preserve"> PAGEREF _Toc238318141 \h </w:instrText>
         </w:r>
         <w:r>
           <w:rPr>
@@ -1420,7 +1420,7 @@
           <w14:ligatures w14:val="standardContextual"/>
         </w:rPr>
       </w:pPr>
-      <w:hyperlink w:anchor="_Toc238305753" w:history="1">
+      <w:hyperlink w:anchor="_Toc238318142" w:history="1">
         <w:r>
           <w:rPr>
             <w:rStyle w:val="Hyperlink"/>
@@ -1449,7 +1449,7 @@
             <w:noProof/>
             <w:webHidden/>
           </w:rPr>
-          <w:instrText xml:space="preserve"> PAGEREF _Toc238305753 \h </w:instrText>
+          <w:instrText xml:space="preserve"> PAGEREF _Toc238318142 \h </w:instrText>
         </w:r>
         <w:r>
           <w:rPr>
@@ -1495,7 +1495,7 @@
           <w14:ligatures w14:val="standardContextual"/>
         </w:rPr>
       </w:pPr>
-      <w:hyperlink w:anchor="_Toc238305754" w:history="1">
+      <w:hyperlink w:anchor="_Toc238318143" w:history="1">
         <w:r>
           <w:rPr>
             <w:rStyle w:val="Hyperlink"/>
@@ -1524,7 +1524,7 @@
             <w:noProof/>
             <w:webHidden/>
           </w:rPr>
-          <w:instrText xml:space="preserve"> PAGEREF _Toc238305754 \h </w:instrText>
+          <w:instrText xml:space="preserve"> PAGEREF _Toc238318143 \h </w:instrText>
         </w:r>
         <w:r>
           <w:rPr>
@@ -1570,7 +1570,7 @@
           <w14:ligatures w14:val="standardContextual"/>
         </w:rPr>
       </w:pPr>
-      <w:hyperlink w:anchor="_Toc238305755" w:history="1">
+      <w:hyperlink w:anchor="_Toc238318144" w:history="1">
         <w:r>
           <w:rPr>
             <w:rStyle w:val="Hyperlink"/>
@@ -1599,7 +1599,7 @@
             <w:noProof/>
             <w:webHidden/>
           </w:rPr>
-          <w:instrText xml:space="preserve"> PAGEREF _Toc238305755 \h </w:instrText>
+          <w:instrText xml:space="preserve"> PAGEREF _Toc238318144 \h </w:instrText>
         </w:r>
         <w:r>
           <w:rPr>
@@ -1645,7 +1645,7 @@
           <w14:ligatures w14:val="standardContextual"/>
         </w:rPr>
       </w:pPr>
-      <w:hyperlink w:anchor="_Toc238305756" w:history="1">
+      <w:hyperlink w:anchor="_Toc238318145" w:history="1">
         <w:r>
           <w:rPr>
             <w:rStyle w:val="Hyperlink"/>
@@ -1674,7 +1674,7 @@
             <w:noProof/>
             <w:webHidden/>
           </w:rPr>
-          <w:instrText xml:space="preserve"> PAGEREF _Toc238305756 \h </w:instrText>
+          <w:instrText xml:space="preserve"> PAGEREF _Toc238318145 \h </w:instrText>
         </w:r>
         <w:r>
           <w:rPr>
@@ -1720,7 +1720,7 @@
           <w14:ligatures w14:val="standardContextual"/>
         </w:rPr>
       </w:pPr>
-      <w:hyperlink w:anchor="_Toc238305757" w:history="1">
+      <w:hyperlink w:anchor="_Toc238318146" w:history="1">
         <w:r>
           <w:rPr>
             <w:rStyle w:val="Hyperlink"/>
@@ -1749,7 +1749,7 @@
             <w:noProof/>
             <w:webHidden/>
           </w:rPr>
-          <w:instrText xml:space="preserve"> PAGEREF _Toc238305757 \h </w:instrText>
+          <w:instrText xml:space="preserve"> PAGEREF _Toc238318146 \h </w:instrText>
         </w:r>
         <w:r>
           <w:rPr>
@@ -1795,7 +1795,7 @@
           <w14:ligatures w14:val="standardContextual"/>
         </w:rPr>
       </w:pPr>
-      <w:hyperlink w:anchor="_Toc238305758" w:history="1">
+      <w:hyperlink w:anchor="_Toc238318147" w:history="1">
         <w:r>
           <w:rPr>
             <w:rStyle w:val="Hyperlink"/>
@@ -1824,7 +1824,7 @@
             <w:noProof/>
             <w:webHidden/>
           </w:rPr>
-          <w:instrText xml:space="preserve"> PAGEREF _Toc238305758 \h </w:instrText>
+          <w:instrText xml:space="preserve"> PAGEREF _Toc238318147 \h </w:instrText>
         </w:r>
         <w:r>
           <w:rPr>
@@ -1870,7 +1870,7 @@
           <w14:ligatures w14:val="standardContextual"/>
         </w:rPr>
       </w:pPr>
-      <w:hyperlink w:anchor="_Toc238305759" w:history="1">
+      <w:hyperlink w:anchor="_Toc238318148" w:history="1">
         <w:r>
           <w:rPr>
             <w:rStyle w:val="Hyperlink"/>
@@ -1899,7 +1899,7 @@
             <w:noProof/>
             <w:webHidden/>
           </w:rPr>
-          <w:instrText xml:space="preserve"> PAGEREF _Toc238305759 \h </w:instrText>
+          <w:instrText xml:space="preserve"> PAGEREF _Toc238318148 \h </w:instrText>
         </w:r>
         <w:r>
           <w:rPr>
@@ -1945,7 +1945,7 @@
           <w14:ligatures w14:val="standardContextual"/>
         </w:rPr>
       </w:pPr>
-      <w:hyperlink w:anchor="_Toc238305760" w:history="1">
+      <w:hyperlink w:anchor="_Toc238318149" w:history="1">
         <w:r>
           <w:rPr>
             <w:rStyle w:val="Hyperlink"/>
@@ -1974,7 +1974,7 @@
             <w:noProof/>
             <w:webHidden/>
           </w:rPr>
-          <w:instrText xml:space="preserve"> PAGEREF _Toc238305760 \h </w:instrText>
+          <w:instrText xml:space="preserve"> PAGEREF _Toc238318149 \h </w:instrText>
         </w:r>
         <w:r>
           <w:rPr>
@@ -2020,7 +2020,7 @@
           <w14:ligatures w14:val="standardContextual"/>
         </w:rPr>
       </w:pPr>
-      <w:hyperlink w:anchor="_Toc238305761" w:history="1">
+      <w:hyperlink w:anchor="_Toc238318150" w:history="1">
         <w:r>
           <w:rPr>
             <w:rStyle w:val="Hyperlink"/>
@@ -2049,7 +2049,7 @@
             <w:noProof/>
             <w:webHidden/>
           </w:rPr>
-          <w:instrText xml:space="preserve"> PAGEREF _Toc238305761 \h </w:instrText>
+          <w:instrText xml:space="preserve"> PAGEREF _Toc238318150 \h </w:instrText>
         </w:r>
         <w:r>
           <w:rPr>
@@ -2095,7 +2095,7 @@
           <w14:ligatures w14:val="standardContextual"/>
         </w:rPr>
       </w:pPr>
-      <w:hyperlink w:anchor="_Toc238305762" w:history="1">
+      <w:hyperlink w:anchor="_Toc238318151" w:history="1">
         <w:r>
           <w:rPr>
             <w:rStyle w:val="Hyperlink"/>
@@ -2124,7 +2124,7 @@
             <w:noProof/>
             <w:webHidden/>
           </w:rPr>
-          <w:instrText xml:space="preserve"> PAGEREF _Toc238305762 \h </w:instrText>
+          <w:instrText xml:space="preserve"> PAGEREF _Toc238318151 \h </w:instrText>
         </w:r>
         <w:r>
           <w:rPr>
@@ -2170,7 +2170,7 @@
           <w14:ligatures w14:val="standardContextual"/>
         </w:rPr>
       </w:pPr>
-      <w:hyperlink w:anchor="_Toc238305763" w:history="1">
+      <w:hyperlink w:anchor="_Toc238318152" w:history="1">
         <w:r>
           <w:rPr>
             <w:rStyle w:val="Hyperlink"/>
@@ -2199,7 +2199,7 @@
             <w:noProof/>
             <w:webHidden/>
           </w:rPr>
-          <w:instrText xml:space="preserve"> PAGEREF _Toc238305763 \h </w:instrText>
+          <w:instrText xml:space="preserve"> PAGEREF _Toc238318152 \h </w:instrText>
         </w:r>
         <w:r>
           <w:rPr>
@@ -2245,7 +2245,7 @@
           <w14:ligatures w14:val="standardContextual"/>
         </w:rPr>
       </w:pPr>
-      <w:hyperlink w:anchor="_Toc238305764" w:history="1">
+      <w:hyperlink w:anchor="_Toc238318153" w:history="1">
         <w:r>
           <w:rPr>
             <w:rStyle w:val="Hyperlink"/>
@@ -2274,7 +2274,7 @@
             <w:noProof/>
             <w:webHidden/>
           </w:rPr>
-          <w:instrText xml:space="preserve"> PAGEREF _Toc238305764 \h </w:instrText>
+          <w:instrText xml:space="preserve"> PAGEREF _Toc238318153 \h </w:instrText>
         </w:r>
         <w:r>
           <w:rPr>
@@ -2320,7 +2320,7 @@
           <w14:ligatures w14:val="standardContextual"/>
         </w:rPr>
       </w:pPr>
-      <w:hyperlink w:anchor="_Toc238305765" w:history="1">
+      <w:hyperlink w:anchor="_Toc238318154" w:history="1">
         <w:r>
           <w:rPr>
             <w:rStyle w:val="Hyperlink"/>
@@ -2349,7 +2349,7 @@
             <w:noProof/>
             <w:webHidden/>
           </w:rPr>
-          <w:instrText xml:space="preserve"> PAGEREF _Toc238305765 \h </w:instrText>
+          <w:instrText xml:space="preserve"> PAGEREF _Toc238318154 \h </w:instrText>
         </w:r>
         <w:r>
           <w:rPr>
@@ -2395,7 +2395,7 @@
           <w14:ligatures w14:val="standardContextual"/>
         </w:rPr>
       </w:pPr>
-      <w:hyperlink w:anchor="_Toc238305766" w:history="1">
+      <w:hyperlink w:anchor="_Toc238318155" w:history="1">
         <w:r>
           <w:rPr>
             <w:rStyle w:val="Hyperlink"/>
@@ -2424,7 +2424,7 @@
             <w:noProof/>
             <w:webHidden/>
           </w:rPr>
-          <w:instrText xml:space="preserve"> PAGEREF _Toc238305766 \h </w:instrText>
+          <w:instrText xml:space="preserve"> PAGEREF _Toc238318155 \h </w:instrText>
         </w:r>
         <w:r>
           <w:rPr>
@@ -2470,7 +2470,7 @@
           <w14:ligatures w14:val="standardContextual"/>
         </w:rPr>
       </w:pPr>
-      <w:hyperlink w:anchor="_Toc238305767" w:history="1">
+      <w:hyperlink w:anchor="_Toc238318156" w:history="1">
         <w:r>
           <w:rPr>
             <w:rStyle w:val="Hyperlink"/>
@@ -2499,7 +2499,7 @@
             <w:noProof/>
             <w:webHidden/>
           </w:rPr>
-          <w:instrText xml:space="preserve"> PAGEREF _Toc238305767 \h </w:instrText>
+          <w:instrText xml:space="preserve"> PAGEREF _Toc238318156 \h </w:instrText>
         </w:r>
         <w:r>
           <w:rPr>
@@ -2545,7 +2545,7 @@
           <w14:ligatures w14:val="standardContextual"/>
         </w:rPr>
       </w:pPr>
-      <w:hyperlink w:anchor="_Toc238305768" w:history="1">
+      <w:hyperlink w:anchor="_Toc238318157" w:history="1">
         <w:r>
           <w:rPr>
             <w:rStyle w:val="Hyperlink"/>
@@ -2573,7 +2573,7 @@
             <w:noProof/>
             <w:webHidden/>
           </w:rPr>
-          <w:instrText xml:space="preserve"> PAGEREF _Toc238305768 \h </w:instrText>
+          <w:instrText xml:space="preserve"> PAGEREF _Toc238318157 \h </w:instrText>
         </w:r>
         <w:r>
           <w:rPr>
@@ -2619,7 +2619,7 @@
           <w14:ligatures w14:val="standardContextual"/>
         </w:rPr>
       </w:pPr>
-      <w:hyperlink w:anchor="_Toc238305769" w:history="1">
+      <w:hyperlink w:anchor="_Toc238318158" w:history="1">
         <w:r>
           <w:rPr>
             <w:rStyle w:val="Hyperlink"/>
@@ -2647,7 +2647,7 @@
             <w:noProof/>
             <w:webHidden/>
           </w:rPr>
-          <w:instrText xml:space="preserve"> PAGEREF _Toc238305769 \h </w:instrText>
+          <w:instrText xml:space="preserve"> PAGEREF _Toc238318158 \h </w:instrText>
         </w:r>
         <w:r>
           <w:rPr>
@@ -2693,7 +2693,7 @@
           <w14:ligatures w14:val="standardContextual"/>
         </w:rPr>
       </w:pPr>
-      <w:hyperlink w:anchor="_Toc238305770" w:history="1">
+      <w:hyperlink w:anchor="_Toc238318159" w:history="1">
         <w:r>
           <w:rPr>
             <w:rStyle w:val="Hyperlink"/>
@@ -2721,7 +2721,7 @@
             <w:noProof/>
             <w:webHidden/>
           </w:rPr>
-          <w:instrText xml:space="preserve"> PAGEREF _Toc238305770 \h </w:instrText>
+          <w:instrText xml:space="preserve"> PAGEREF _Toc238318159 \h </w:instrText>
         </w:r>
         <w:r>
           <w:rPr>
@@ -2767,7 +2767,7 @@
           <w14:ligatures w14:val="standardContextual"/>
         </w:rPr>
       </w:pPr>
-      <w:hyperlink w:anchor="_Toc238305771" w:history="1">
+      <w:hyperlink w:anchor="_Toc238318160" w:history="1">
         <w:r>
           <w:rPr>
             <w:rStyle w:val="Hyperlink"/>
@@ -2795,7 +2795,7 @@
             <w:noProof/>
             <w:webHidden/>
           </w:rPr>
-          <w:instrText xml:space="preserve"> PAGEREF _Toc238305771 \h </w:instrText>
+          <w:instrText xml:space="preserve"> PAGEREF _Toc238318160 \h </w:instrText>
         </w:r>
         <w:r>
           <w:rPr>
@@ -2841,7 +2841,7 @@
           <w14:ligatures w14:val="standardContextual"/>
         </w:rPr>
       </w:pPr>
-      <w:hyperlink w:anchor="_Toc238305772" w:history="1">
+      <w:hyperlink w:anchor="_Toc238318161" w:history="1">
         <w:r>
           <w:rPr>
             <w:rStyle w:val="Hyperlink"/>
@@ -2869,7 +2869,7 @@
             <w:noProof/>
             <w:webHidden/>
           </w:rPr>
-          <w:instrText xml:space="preserve"> PAGEREF _Toc238305772 \h </w:instrText>
+          <w:instrText xml:space="preserve"> PAGEREF _Toc238318161 \h </w:instrText>
         </w:r>
         <w:r>
           <w:rPr>
@@ -2915,7 +2915,7 @@
           <w14:ligatures w14:val="standardContextual"/>
         </w:rPr>
       </w:pPr>
-      <w:hyperlink w:anchor="_Toc238305773" w:history="1">
+      <w:hyperlink w:anchor="_Toc238318162" w:history="1">
         <w:r>
           <w:rPr>
             <w:rStyle w:val="Hyperlink"/>
@@ -2943,7 +2943,7 @@
             <w:noProof/>
             <w:webHidden/>
           </w:rPr>
-          <w:instrText xml:space="preserve"> PAGEREF _Toc238305773 \h </w:instrText>
+          <w:instrText xml:space="preserve"> PAGEREF _Toc238318162 \h </w:instrText>
         </w:r>
         <w:r>
           <w:rPr>
@@ -2989,7 +2989,7 @@
           <w14:ligatures w14:val="standardContextual"/>
         </w:rPr>
       </w:pPr>
-      <w:hyperlink w:anchor="_Toc238305774" w:history="1">
+      <w:hyperlink w:anchor="_Toc238318163" w:history="1">
         <w:r>
           <w:rPr>
             <w:rStyle w:val="Hyperlink"/>
@@ -3017,7 +3017,7 @@
             <w:noProof/>
             <w:webHidden/>
           </w:rPr>
-          <w:instrText xml:space="preserve"> PAGEREF _Toc238305774 \h </w:instrText>
+          <w:instrText xml:space="preserve"> PAGEREF _Toc238318163 \h </w:instrText>
         </w:r>
         <w:r>
           <w:rPr>
@@ -3063,7 +3063,7 @@
           <w14:ligatures w14:val="standardContextual"/>
         </w:rPr>
       </w:pPr>
-      <w:hyperlink w:anchor="_Toc238305775" w:history="1">
+      <w:hyperlink w:anchor="_Toc238318164" w:history="1">
         <w:r>
           <w:rPr>
             <w:rStyle w:val="Hyperlink"/>
@@ -3091,7 +3091,7 @@
             <w:noProof/>
             <w:webHidden/>
           </w:rPr>
-          <w:instrText xml:space="preserve"> PAGEREF _Toc238305775 \h </w:instrText>
+          <w:instrText xml:space="preserve"> PAGEREF _Toc238318164 \h </w:instrText>
         </w:r>
         <w:r>
           <w:rPr>
@@ -3137,7 +3137,7 @@
           <w14:ligatures w14:val="standardContextual"/>
         </w:rPr>
       </w:pPr>
-      <w:hyperlink w:anchor="_Toc238305776" w:history="1">
+      <w:hyperlink w:anchor="_Toc238318165" w:history="1">
         <w:r>
           <w:rPr>
             <w:rStyle w:val="Hyperlink"/>
@@ -3165,7 +3165,7 @@
             <w:noProof/>
             <w:webHidden/>
           </w:rPr>
-          <w:instrText xml:space="preserve"> PAGEREF _Toc238305776 \h </w:instrText>
+          <w:instrText xml:space="preserve"> PAGEREF _Toc238318165 \h </w:instrText>
         </w:r>
         <w:r>
           <w:rPr>
@@ -3211,7 +3211,7 @@
           <w14:ligatures w14:val="standardContextual"/>
         </w:rPr>
       </w:pPr>
-      <w:hyperlink w:anchor="_Toc238305777" w:history="1">
+      <w:hyperlink w:anchor="_Toc238318166" w:history="1">
         <w:r>
           <w:rPr>
             <w:rStyle w:val="Hyperlink"/>
@@ -3240,7 +3240,7 @@
             <w:noProof/>
             <w:webHidden/>
           </w:rPr>
-          <w:instrText xml:space="preserve"> PAGEREF _Toc238305777 \h </w:instrText>
+          <w:instrText xml:space="preserve"> PAGEREF _Toc238318166 \h </w:instrText>
         </w:r>
         <w:r>
           <w:rPr>
@@ -3286,7 +3286,7 @@
           <w14:ligatures w14:val="standardContextual"/>
         </w:rPr>
       </w:pPr>
-      <w:hyperlink w:anchor="_Toc238305778" w:history="1">
+      <w:hyperlink w:anchor="_Toc238318167" w:history="1">
         <w:r>
           <w:rPr>
             <w:rStyle w:val="Hyperlink"/>
@@ -3315,7 +3315,7 @@
             <w:noProof/>
             <w:webHidden/>
           </w:rPr>
-          <w:instrText xml:space="preserve"> PAGEREF _Toc238305778 \h </w:instrText>
+          <w:instrText xml:space="preserve"> PAGEREF _Toc238318167 \h </w:instrText>
         </w:r>
         <w:r>
           <w:rPr>
@@ -3361,7 +3361,7 @@
           <w14:ligatures w14:val="standardContextual"/>
         </w:rPr>
       </w:pPr>
-      <w:hyperlink w:anchor="_Toc238305779" w:history="1">
+      <w:hyperlink w:anchor="_Toc238318168" w:history="1">
         <w:r>
           <w:rPr>
             <w:rStyle w:val="Hyperlink"/>
@@ -3390,7 +3390,7 @@
             <w:noProof/>
             <w:webHidden/>
           </w:rPr>
-          <w:instrText xml:space="preserve"> PAGEREF _Toc238305779 \h </w:instrText>
+          <w:instrText xml:space="preserve"> PAGEREF _Toc238318168 \h </w:instrText>
         </w:r>
         <w:r>
           <w:rPr>
@@ -3436,7 +3436,7 @@
           <w14:ligatures w14:val="standardContextual"/>
         </w:rPr>
       </w:pPr>
-      <w:hyperlink w:anchor="_Toc238305780" w:history="1">
+      <w:hyperlink w:anchor="_Toc238318169" w:history="1">
         <w:r>
           <w:rPr>
             <w:rStyle w:val="Hyperlink"/>
@@ -3465,7 +3465,7 @@
             <w:noProof/>
             <w:webHidden/>
           </w:rPr>
-          <w:instrText xml:space="preserve"> PAGEREF _Toc238305780 \h </w:instrText>
+          <w:instrText xml:space="preserve"> PAGEREF _Toc238318169 \h </w:instrText>
         </w:r>
         <w:r>
           <w:rPr>
@@ -3511,7 +3511,7 @@
           <w14:ligatures w14:val="standardContextual"/>
         </w:rPr>
       </w:pPr>
-      <w:hyperlink w:anchor="_Toc238305781" w:history="1">
+      <w:hyperlink w:anchor="_Toc238318170" w:history="1">
         <w:r>
           <w:rPr>
             <w:rStyle w:val="Hyperlink"/>
@@ -3540,7 +3540,7 @@
             <w:noProof/>
             <w:webHidden/>
           </w:rPr>
-          <w:instrText xml:space="preserve"> PAGEREF _Toc238305781 \h </w:instrText>
+          <w:instrText xml:space="preserve"> PAGEREF _Toc238318170 \h </w:instrText>
         </w:r>
         <w:r>
           <w:rPr>
@@ -3586,7 +3586,7 @@
           <w14:ligatures w14:val="standardContextual"/>
         </w:rPr>
       </w:pPr>
-      <w:hyperlink w:anchor="_Toc238305782" w:history="1">
+      <w:hyperlink w:anchor="_Toc238318171" w:history="1">
         <w:r>
           <w:rPr>
             <w:rStyle w:val="Hyperlink"/>
@@ -3615,7 +3615,7 @@
             <w:noProof/>
             <w:webHidden/>
           </w:rPr>
-          <w:instrText xml:space="preserve"> PAGEREF _Toc238305782 \h </w:instrText>
+          <w:instrText xml:space="preserve"> PAGEREF _Toc238318171 \h </w:instrText>
         </w:r>
         <w:r>
           <w:rPr>
@@ -3661,7 +3661,7 @@
           <w14:ligatures w14:val="standardContextual"/>
         </w:rPr>
       </w:pPr>
-      <w:hyperlink w:anchor="_Toc238305783" w:history="1">
+      <w:hyperlink w:anchor="_Toc238318172" w:history="1">
         <w:r>
           <w:rPr>
             <w:rStyle w:val="Hyperlink"/>
@@ -3690,7 +3690,7 @@
             <w:noProof/>
             <w:webHidden/>
           </w:rPr>
-          <w:instrText xml:space="preserve"> PAGEREF _Toc238305783 \h </w:instrText>
+          <w:instrText xml:space="preserve"> PAGEREF _Toc238318172 \h </w:instrText>
         </w:r>
         <w:r>
           <w:rPr>
@@ -3736,7 +3736,7 @@
           <w14:ligatures w14:val="standardContextual"/>
         </w:rPr>
       </w:pPr>
-      <w:hyperlink w:anchor="_Toc238305784" w:history="1">
+      <w:hyperlink w:anchor="_Toc238318173" w:history="1">
         <w:r>
           <w:rPr>
             <w:rStyle w:val="Hyperlink"/>
@@ -3765,7 +3765,7 @@
             <w:noProof/>
             <w:webHidden/>
           </w:rPr>
-          <w:instrText xml:space="preserve"> PAGEREF _Toc238305784 \h </w:instrText>
+          <w:instrText xml:space="preserve"> PAGEREF _Toc238318173 \h </w:instrText>
         </w:r>
         <w:r>
           <w:rPr>
@@ -3811,7 +3811,7 @@
           <w14:ligatures w14:val="standardContextual"/>
         </w:rPr>
       </w:pPr>
-      <w:hyperlink w:anchor="_Toc238305785" w:history="1">
+      <w:hyperlink w:anchor="_Toc238318174" w:history="1">
         <w:r>
           <w:rPr>
             <w:rStyle w:val="Hyperlink"/>
@@ -3840,7 +3840,7 @@
             <w:noProof/>
             <w:webHidden/>
           </w:rPr>
-          <w:instrText xml:space="preserve"> PAGEREF _Toc238305785 \h </w:instrText>
+          <w:instrText xml:space="preserve"> PAGEREF _Toc238318174 \h </w:instrText>
         </w:r>
         <w:r>
           <w:rPr>
@@ -3886,7 +3886,7 @@
           <w14:ligatures w14:val="standardContextual"/>
         </w:rPr>
       </w:pPr>
-      <w:hyperlink w:anchor="_Toc238305786" w:history="1">
+      <w:hyperlink w:anchor="_Toc238318175" w:history="1">
         <w:r>
           <w:rPr>
             <w:rStyle w:val="Hyperlink"/>
@@ -3915,7 +3915,7 @@
             <w:noProof/>
             <w:webHidden/>
           </w:rPr>
-          <w:instrText xml:space="preserve"> PAGEREF _Toc238305786 \h </w:instrText>
+          <w:instrText xml:space="preserve"> PAGEREF _Toc238318175 \h </w:instrText>
         </w:r>
         <w:r>
           <w:rPr>
@@ -3961,7 +3961,7 @@
           <w14:ligatures w14:val="standardContextual"/>
         </w:rPr>
       </w:pPr>
-      <w:hyperlink w:anchor="_Toc238305787" w:history="1">
+      <w:hyperlink w:anchor="_Toc238318176" w:history="1">
         <w:r>
           <w:rPr>
             <w:rStyle w:val="Hyperlink"/>
@@ -3990,7 +3990,7 @@
             <w:noProof/>
             <w:webHidden/>
           </w:rPr>
-          <w:instrText xml:space="preserve"> PAGEREF _Toc238305787 \h </w:instrText>
+          <w:instrText xml:space="preserve"> PAGEREF _Toc238318176 \h </w:instrText>
         </w:r>
         <w:r>
           <w:rPr>
@@ -4036,7 +4036,7 @@
           <w14:ligatures w14:val="standardContextual"/>
         </w:rPr>
       </w:pPr>
-      <w:hyperlink w:anchor="_Toc238305788" w:history="1">
+      <w:hyperlink w:anchor="_Toc238318177" w:history="1">
         <w:r>
           <w:rPr>
             <w:rStyle w:val="Hyperlink"/>
@@ -4065,7 +4065,7 @@
             <w:noProof/>
             <w:webHidden/>
           </w:rPr>
-          <w:instrText xml:space="preserve"> PAGEREF _Toc238305788 \h </w:instrText>
+          <w:instrText xml:space="preserve"> PAGEREF _Toc238318177 \h </w:instrText>
         </w:r>
         <w:r>
           <w:rPr>
@@ -4111,7 +4111,7 @@
           <w14:ligatures w14:val="standardContextual"/>
         </w:rPr>
       </w:pPr>
-      <w:hyperlink w:anchor="_Toc238305789" w:history="1">
+      <w:hyperlink w:anchor="_Toc238318178" w:history="1">
         <w:r>
           <w:rPr>
             <w:rStyle w:val="Hyperlink"/>
@@ -4140,7 +4140,7 @@
             <w:noProof/>
             <w:webHidden/>
           </w:rPr>
-          <w:instrText xml:space="preserve"> PAGEREF _Toc238305789 \h </w:instrText>
+          <w:instrText xml:space="preserve"> PAGEREF _Toc238318178 \h </w:instrText>
         </w:r>
         <w:r>
           <w:rPr>
@@ -4186,7 +4186,7 @@
           <w14:ligatures w14:val="standardContextual"/>
         </w:rPr>
       </w:pPr>
-      <w:hyperlink w:anchor="_Toc238305790" w:history="1">
+      <w:hyperlink w:anchor="_Toc238318179" w:history="1">
         <w:r>
           <w:rPr>
             <w:rStyle w:val="Hyperlink"/>
@@ -4215,7 +4215,7 @@
             <w:noProof/>
             <w:webHidden/>
           </w:rPr>
-          <w:instrText xml:space="preserve"> PAGEREF _Toc238305790 \h </w:instrText>
+          <w:instrText xml:space="preserve"> PAGEREF _Toc238318179 \h </w:instrText>
         </w:r>
         <w:r>
           <w:rPr>
@@ -4261,7 +4261,7 @@
           <w14:ligatures w14:val="standardContextual"/>
         </w:rPr>
       </w:pPr>
-      <w:hyperlink w:anchor="_Toc238305791" w:history="1">
+      <w:hyperlink w:anchor="_Toc238318180" w:history="1">
         <w:r>
           <w:rPr>
             <w:rStyle w:val="Hyperlink"/>
@@ -4290,7 +4290,7 @@
             <w:noProof/>
             <w:webHidden/>
           </w:rPr>
-          <w:instrText xml:space="preserve"> PAGEREF _Toc238305791 \h </w:instrText>
+          <w:instrText xml:space="preserve"> PAGEREF _Toc238318180 \h </w:instrText>
         </w:r>
         <w:r>
           <w:rPr>
@@ -4336,7 +4336,7 @@
           <w14:ligatures w14:val="standardContextual"/>
         </w:rPr>
       </w:pPr>
-      <w:hyperlink w:anchor="_Toc238305792" w:history="1">
+      <w:hyperlink w:anchor="_Toc238318181" w:history="1">
         <w:r>
           <w:rPr>
             <w:rStyle w:val="Hyperlink"/>
@@ -4365,7 +4365,7 @@
             <w:noProof/>
             <w:webHidden/>
           </w:rPr>
-          <w:instrText xml:space="preserve"> PAGEREF _Toc238305792 \h </w:instrText>
+          <w:instrText xml:space="preserve"> PAGEREF _Toc238318181 \h </w:instrText>
         </w:r>
         <w:r>
           <w:rPr>
@@ -4411,7 +4411,7 @@
           <w14:ligatures w14:val="standardContextual"/>
         </w:rPr>
       </w:pPr>
-      <w:hyperlink w:anchor="_Toc238305793" w:history="1">
+      <w:hyperlink w:anchor="_Toc238318182" w:history="1">
         <w:r>
           <w:rPr>
             <w:rStyle w:val="Hyperlink"/>
@@ -4440,7 +4440,7 @@
             <w:noProof/>
             <w:webHidden/>
           </w:rPr>
-          <w:instrText xml:space="preserve"> PAGEREF _Toc238305793 \h </w:instrText>
+          <w:instrText xml:space="preserve"> PAGEREF _Toc238318182 \h </w:instrText>
         </w:r>
         <w:r>
           <w:rPr>
@@ -4486,7 +4486,7 @@
           <w14:ligatures w14:val="standardContextual"/>
         </w:rPr>
       </w:pPr>
-      <w:hyperlink w:anchor="_Toc238305794" w:history="1">
+      <w:hyperlink w:anchor="_Toc238318183" w:history="1">
         <w:r>
           <w:rPr>
             <w:rStyle w:val="Hyperlink"/>
@@ -4515,7 +4515,7 @@
             <w:noProof/>
             <w:webHidden/>
           </w:rPr>
-          <w:instrText xml:space="preserve"> PAGEREF _Toc238305794 \h </w:instrText>
+          <w:instrText xml:space="preserve"> PAGEREF _Toc238318183 \h </w:instrText>
         </w:r>
         <w:r>
           <w:rPr>
@@ -4561,7 +4561,7 @@
           <w14:ligatures w14:val="standardContextual"/>
         </w:rPr>
       </w:pPr>
-      <w:hyperlink w:anchor="_Toc238305795" w:history="1">
+      <w:hyperlink w:anchor="_Toc238318184" w:history="1">
         <w:r>
           <w:rPr>
             <w:rStyle w:val="Hyperlink"/>
@@ -4590,7 +4590,7 @@
             <w:noProof/>
             <w:webHidden/>
           </w:rPr>
-          <w:instrText xml:space="preserve"> PAGEREF _Toc238305795 \h </w:instrText>
+          <w:instrText xml:space="preserve"> PAGEREF _Toc238318184 \h </w:instrText>
         </w:r>
         <w:r>
           <w:rPr>
@@ -4636,7 +4636,7 @@
           <w14:ligatures w14:val="standardContextual"/>
         </w:rPr>
       </w:pPr>
-      <w:hyperlink w:anchor="_Toc238305796" w:history="1">
+      <w:hyperlink w:anchor="_Toc238318185" w:history="1">
         <w:r>
           <w:rPr>
             <w:rStyle w:val="Hyperlink"/>
@@ -4665,7 +4665,7 @@
             <w:noProof/>
             <w:webHidden/>
           </w:rPr>
-          <w:instrText xml:space="preserve"> PAGEREF _Toc238305796 \h </w:instrText>
+          <w:instrText xml:space="preserve"> PAGEREF _Toc238318185 \h </w:instrText>
         </w:r>
         <w:r>
           <w:rPr>
@@ -4711,7 +4711,7 @@
           <w14:ligatures w14:val="standardContextual"/>
         </w:rPr>
       </w:pPr>
-      <w:hyperlink w:anchor="_Toc238305797" w:history="1">
+      <w:hyperlink w:anchor="_Toc238318186" w:history="1">
         <w:r>
           <w:rPr>
             <w:rStyle w:val="Hyperlink"/>
@@ -4740,7 +4740,7 @@
             <w:noProof/>
             <w:webHidden/>
           </w:rPr>
-          <w:instrText xml:space="preserve"> PAGEREF _Toc238305797 \h </w:instrText>
+          <w:instrText xml:space="preserve"> PAGEREF _Toc238318186 \h </w:instrText>
         </w:r>
         <w:r>
           <w:rPr>
@@ -4786,7 +4786,7 @@
           <w14:ligatures w14:val="standardContextual"/>
         </w:rPr>
       </w:pPr>
-      <w:hyperlink w:anchor="_Toc238305798" w:history="1">
+      <w:hyperlink w:anchor="_Toc238318187" w:history="1">
         <w:r>
           <w:rPr>
             <w:rStyle w:val="Hyperlink"/>
@@ -4815,7 +4815,7 @@
             <w:noProof/>
             <w:webHidden/>
           </w:rPr>
-          <w:instrText xml:space="preserve"> PAGEREF _Toc238305798 \h </w:instrText>
+          <w:instrText xml:space="preserve"> PAGEREF _Toc238318187 \h </w:instrText>
         </w:r>
         <w:r>
           <w:rPr>
@@ -4861,7 +4861,7 @@
           <w14:ligatures w14:val="standardContextual"/>
         </w:rPr>
       </w:pPr>
-      <w:hyperlink w:anchor="_Toc238305799" w:history="1">
+      <w:hyperlink w:anchor="_Toc238318188" w:history="1">
         <w:r>
           <w:rPr>
             <w:rStyle w:val="Hyperlink"/>
@@ -4890,7 +4890,7 @@
             <w:noProof/>
             <w:webHidden/>
           </w:rPr>
-          <w:instrText xml:space="preserve"> PAGEREF _Toc238305799 \h </w:instrText>
+          <w:instrText xml:space="preserve"> PAGEREF _Toc238318188 \h </w:instrText>
         </w:r>
         <w:r>
           <w:rPr>
@@ -4936,7 +4936,7 @@
           <w14:ligatures w14:val="standardContextual"/>
         </w:rPr>
       </w:pPr>
-      <w:hyperlink w:anchor="_Toc238305800" w:history="1">
+      <w:hyperlink w:anchor="_Toc238318189" w:history="1">
         <w:r>
           <w:rPr>
             <w:rStyle w:val="Hyperlink"/>
@@ -4965,7 +4965,7 @@
             <w:noProof/>
             <w:webHidden/>
           </w:rPr>
-          <w:instrText xml:space="preserve"> PAGEREF _Toc238305800 \h </w:instrText>
+          <w:instrText xml:space="preserve"> PAGEREF _Toc238318189 \h </w:instrText>
         </w:r>
         <w:r>
           <w:rPr>
@@ -5011,7 +5011,7 @@
           <w14:ligatures w14:val="standardContextual"/>
         </w:rPr>
       </w:pPr>
-      <w:hyperlink w:anchor="_Toc238305801" w:history="1">
+      <w:hyperlink w:anchor="_Toc238318190" w:history="1">
         <w:r>
           <w:rPr>
             <w:rStyle w:val="Hyperlink"/>
@@ -5040,7 +5040,7 @@
             <w:noProof/>
             <w:webHidden/>
           </w:rPr>
-          <w:instrText xml:space="preserve"> PAGEREF _Toc238305801 \h </w:instrText>
+          <w:instrText xml:space="preserve"> PAGEREF _Toc238318190 \h </w:instrText>
         </w:r>
         <w:r>
           <w:rPr>
@@ -5086,7 +5086,7 @@
           <w14:ligatures w14:val="standardContextual"/>
         </w:rPr>
       </w:pPr>
-      <w:hyperlink w:anchor="_Toc238305802" w:history="1">
+      <w:hyperlink w:anchor="_Toc238318191" w:history="1">
         <w:r>
           <w:rPr>
             <w:rStyle w:val="Hyperlink"/>
@@ -5115,7 +5115,7 @@
             <w:noProof/>
             <w:webHidden/>
           </w:rPr>
-          <w:instrText xml:space="preserve"> PAGEREF _Toc238305802 \h </w:instrText>
+          <w:instrText xml:space="preserve"> PAGEREF _Toc238318191 \h </w:instrText>
         </w:r>
         <w:r>
           <w:rPr>
@@ -5161,7 +5161,7 @@
           <w14:ligatures w14:val="standardContextual"/>
         </w:rPr>
       </w:pPr>
-      <w:hyperlink w:anchor="_Toc238305803" w:history="1">
+      <w:hyperlink w:anchor="_Toc238318192" w:history="1">
         <w:r>
           <w:rPr>
             <w:rStyle w:val="Hyperlink"/>
@@ -5190,7 +5190,7 @@
             <w:noProof/>
             <w:webHidden/>
           </w:rPr>
-          <w:instrText xml:space="preserve"> PAGEREF _Toc238305803 \h </w:instrText>
+          <w:instrText xml:space="preserve"> PAGEREF _Toc238318192 \h </w:instrText>
         </w:r>
         <w:r>
           <w:rPr>
@@ -5236,7 +5236,7 @@
           <w14:ligatures w14:val="standardContextual"/>
         </w:rPr>
       </w:pPr>
-      <w:hyperlink w:anchor="_Toc238305804" w:history="1">
+      <w:hyperlink w:anchor="_Toc238318193" w:history="1">
         <w:r>
           <w:rPr>
             <w:rStyle w:val="Hyperlink"/>
@@ -5265,7 +5265,7 @@
             <w:noProof/>
             <w:webHidden/>
           </w:rPr>
-          <w:instrText xml:space="preserve"> PAGEREF _Toc238305804 \h </w:instrText>
+          <w:instrText xml:space="preserve"> PAGEREF _Toc238318193 \h </w:instrText>
         </w:r>
         <w:r>
           <w:rPr>
@@ -5311,7 +5311,7 @@
           <w14:ligatures w14:val="standardContextual"/>
         </w:rPr>
       </w:pPr>
-      <w:hyperlink w:anchor="_Toc238305805" w:history="1">
+      <w:hyperlink w:anchor="_Toc238318194" w:history="1">
         <w:r>
           <w:rPr>
             <w:rStyle w:val="Hyperlink"/>
@@ -5340,7 +5340,7 @@
             <w:noProof/>
             <w:webHidden/>
           </w:rPr>
-          <w:instrText xml:space="preserve"> PAGEREF _Toc238305805 \h </w:instrText>
+          <w:instrText xml:space="preserve"> PAGEREF _Toc238318194 \h </w:instrText>
         </w:r>
         <w:r>
           <w:rPr>
@@ -5386,7 +5386,7 @@
           <w14:ligatures w14:val="standardContextual"/>
         </w:rPr>
       </w:pPr>
-      <w:hyperlink w:anchor="_Toc238305806" w:history="1">
+      <w:hyperlink w:anchor="_Toc238318195" w:history="1">
         <w:r>
           <w:rPr>
             <w:rStyle w:val="Hyperlink"/>
@@ -5415,7 +5415,7 @@
             <w:noProof/>
             <w:webHidden/>
           </w:rPr>
-          <w:instrText xml:space="preserve"> PAGEREF _Toc238305806 \h </w:instrText>
+          <w:instrText xml:space="preserve"> PAGEREF _Toc238318195 \h </w:instrText>
         </w:r>
         <w:r>
           <w:rPr>
@@ -5461,7 +5461,7 @@
           <w14:ligatures w14:val="standardContextual"/>
         </w:rPr>
       </w:pPr>
-      <w:hyperlink w:anchor="_Toc238305807" w:history="1">
+      <w:hyperlink w:anchor="_Toc238318196" w:history="1">
         <w:r>
           <w:rPr>
             <w:rStyle w:val="Hyperlink"/>
@@ -5490,7 +5490,7 @@
             <w:noProof/>
             <w:webHidden/>
           </w:rPr>
-          <w:instrText xml:space="preserve"> PAGEREF _Toc238305807 \h </w:instrText>
+          <w:instrText xml:space="preserve"> PAGEREF _Toc238318196 \h </w:instrText>
         </w:r>
         <w:r>
           <w:rPr>
@@ -5536,7 +5536,7 @@
           <w14:ligatures w14:val="standardContextual"/>
         </w:rPr>
       </w:pPr>
-      <w:hyperlink w:anchor="_Toc238305808" w:history="1">
+      <w:hyperlink w:anchor="_Toc238318197" w:history="1">
         <w:r>
           <w:rPr>
             <w:rStyle w:val="Hyperlink"/>
@@ -5565,7 +5565,7 @@
             <w:noProof/>
             <w:webHidden/>
           </w:rPr>
-          <w:instrText xml:space="preserve"> PAGEREF _Toc238305808 \h </w:instrText>
+          <w:instrText xml:space="preserve"> PAGEREF _Toc238318197 \h </w:instrText>
         </w:r>
         <w:r>
           <w:rPr>
@@ -5611,7 +5611,7 @@
           <w14:ligatures w14:val="standardContextual"/>
         </w:rPr>
       </w:pPr>
-      <w:hyperlink w:anchor="_Toc238305809" w:history="1">
+      <w:hyperlink w:anchor="_Toc238318198" w:history="1">
         <w:r>
           <w:rPr>
             <w:rStyle w:val="Hyperlink"/>
@@ -5640,7 +5640,7 @@
             <w:noProof/>
             <w:webHidden/>
           </w:rPr>
-          <w:instrText xml:space="preserve"> PAGEREF _Toc238305809 \h </w:instrText>
+          <w:instrText xml:space="preserve"> PAGEREF _Toc238318198 \h </w:instrText>
         </w:r>
         <w:r>
           <w:rPr>
@@ -5686,7 +5686,7 @@
           <w14:ligatures w14:val="standardContextual"/>
         </w:rPr>
       </w:pPr>
-      <w:hyperlink w:anchor="_Toc238305810" w:history="1">
+      <w:hyperlink w:anchor="_Toc238318199" w:history="1">
         <w:r>
           <w:rPr>
             <w:rStyle w:val="Hyperlink"/>
@@ -5715,7 +5715,7 @@
             <w:noProof/>
             <w:webHidden/>
           </w:rPr>
-          <w:instrText xml:space="preserve"> PAGEREF _Toc238305810 \h </w:instrText>
+          <w:instrText xml:space="preserve"> PAGEREF _Toc238318199 \h </w:instrText>
         </w:r>
         <w:r>
           <w:rPr>
@@ -5761,7 +5761,7 @@
           <w14:ligatures w14:val="standardContextual"/>
         </w:rPr>
       </w:pPr>
-      <w:hyperlink w:anchor="_Toc238305811" w:history="1">
+      <w:hyperlink w:anchor="_Toc238318200" w:history="1">
         <w:r>
           <w:rPr>
             <w:rStyle w:val="Hyperlink"/>
@@ -5790,7 +5790,7 @@
             <w:noProof/>
             <w:webHidden/>
           </w:rPr>
-          <w:instrText xml:space="preserve"> PAGEREF _Toc238305811 \h </w:instrText>
+          <w:instrText xml:space="preserve"> PAGEREF _Toc238318200 \h </w:instrText>
         </w:r>
         <w:r>
           <w:rPr>
@@ -5836,7 +5836,7 @@
           <w14:ligatures w14:val="standardContextual"/>
         </w:rPr>
       </w:pPr>
-      <w:hyperlink w:anchor="_Toc238305812" w:history="1">
+      <w:hyperlink w:anchor="_Toc238318201" w:history="1">
         <w:r>
           <w:rPr>
             <w:rStyle w:val="Hyperlink"/>
@@ -5865,7 +5865,7 @@
             <w:noProof/>
             <w:webHidden/>
           </w:rPr>
-          <w:instrText xml:space="preserve"> PAGEREF _Toc238305812 \h </w:instrText>
+          <w:instrText xml:space="preserve"> PAGEREF _Toc238318201 \h </w:instrText>
         </w:r>
         <w:r>
           <w:rPr>
@@ -5911,7 +5911,7 @@
           <w14:ligatures w14:val="standardContextual"/>
         </w:rPr>
       </w:pPr>
-      <w:hyperlink w:anchor="_Toc238305813" w:history="1">
+      <w:hyperlink w:anchor="_Toc238318202" w:history="1">
         <w:r>
           <w:rPr>
             <w:rStyle w:val="Hyperlink"/>
@@ -5940,7 +5940,7 @@
             <w:noProof/>
             <w:webHidden/>
           </w:rPr>
-          <w:instrText xml:space="preserve"> PAGEREF _Toc238305813 \h </w:instrText>
+          <w:instrText xml:space="preserve"> PAGEREF _Toc238318202 \h </w:instrText>
         </w:r>
         <w:r>
           <w:rPr>
@@ -5986,7 +5986,7 @@
           <w14:ligatures w14:val="standardContextual"/>
         </w:rPr>
       </w:pPr>
-      <w:hyperlink w:anchor="_Toc238305814" w:history="1">
+      <w:hyperlink w:anchor="_Toc238318203" w:history="1">
         <w:r>
           <w:rPr>
             <w:rStyle w:val="Hyperlink"/>
@@ -6015,7 +6015,7 @@
             <w:noProof/>
             <w:webHidden/>
           </w:rPr>
-          <w:instrText xml:space="preserve"> PAGEREF _Toc238305814 \h </w:instrText>
+          <w:instrText xml:space="preserve"> PAGEREF _Toc238318203 \h </w:instrText>
         </w:r>
         <w:r>
           <w:rPr>
@@ -6061,7 +6061,7 @@
           <w14:ligatures w14:val="standardContextual"/>
         </w:rPr>
       </w:pPr>
-      <w:hyperlink w:anchor="_Toc238305815" w:history="1">
+      <w:hyperlink w:anchor="_Toc238318204" w:history="1">
         <w:r>
           <w:rPr>
             <w:rStyle w:val="Hyperlink"/>
@@ -6090,7 +6090,7 @@
             <w:noProof/>
             <w:webHidden/>
           </w:rPr>
-          <w:instrText xml:space="preserve"> PAGEREF _Toc238305815 \h </w:instrText>
+          <w:instrText xml:space="preserve"> PAGEREF _Toc238318204 \h </w:instrText>
         </w:r>
         <w:r>
           <w:rPr>
@@ -6136,7 +6136,7 @@
           <w14:ligatures w14:val="standardContextual"/>
         </w:rPr>
       </w:pPr>
-      <w:hyperlink w:anchor="_Toc238305816" w:history="1">
+      <w:hyperlink w:anchor="_Toc238318205" w:history="1">
         <w:r>
           <w:rPr>
             <w:rStyle w:val="Hyperlink"/>
@@ -6165,7 +6165,7 @@
             <w:noProof/>
             <w:webHidden/>
           </w:rPr>
-          <w:instrText xml:space="preserve"> PAGEREF _Toc238305816 \h </w:instrText>
+          <w:instrText xml:space="preserve"> PAGEREF _Toc238318205 \h </w:instrText>
         </w:r>
         <w:r>
           <w:rPr>
@@ -6211,7 +6211,7 @@
           <w14:ligatures w14:val="standardContextual"/>
         </w:rPr>
       </w:pPr>
-      <w:hyperlink w:anchor="_Toc238305817" w:history="1">
+      <w:hyperlink w:anchor="_Toc238318206" w:history="1">
         <w:r>
           <w:rPr>
             <w:rStyle w:val="Hyperlink"/>
@@ -6240,7 +6240,7 @@
             <w:noProof/>
             <w:webHidden/>
           </w:rPr>
-          <w:instrText xml:space="preserve"> PAGEREF _Toc238305817 \h </w:instrText>
+          <w:instrText xml:space="preserve"> PAGEREF _Toc238318206 \h </w:instrText>
         </w:r>
         <w:r>
           <w:rPr>
@@ -6286,7 +6286,7 @@
           <w14:ligatures w14:val="standardContextual"/>
         </w:rPr>
       </w:pPr>
-      <w:hyperlink w:anchor="_Toc238305818" w:history="1">
+      <w:hyperlink w:anchor="_Toc238318207" w:history="1">
         <w:r>
           <w:rPr>
             <w:rStyle w:val="Hyperlink"/>
@@ -6315,7 +6315,7 @@
             <w:noProof/>
             <w:webHidden/>
           </w:rPr>
-          <w:instrText xml:space="preserve"> PAGEREF _Toc238305818 \h </w:instrText>
+          <w:instrText xml:space="preserve"> PAGEREF _Toc238318207 \h </w:instrText>
         </w:r>
         <w:r>
           <w:rPr>
@@ -6361,7 +6361,7 @@
           <w14:ligatures w14:val="standardContextual"/>
         </w:rPr>
       </w:pPr>
-      <w:hyperlink w:anchor="_Toc238305819" w:history="1">
+      <w:hyperlink w:anchor="_Toc238318208" w:history="1">
         <w:r>
           <w:rPr>
             <w:rStyle w:val="Hyperlink"/>
@@ -6390,7 +6390,7 @@
             <w:noProof/>
             <w:webHidden/>
           </w:rPr>
-          <w:instrText xml:space="preserve"> PAGEREF _Toc238305819 \h </w:instrText>
+          <w:instrText xml:space="preserve"> PAGEREF _Toc238318208 \h </w:instrText>
         </w:r>
         <w:r>
           <w:rPr>
@@ -6436,7 +6436,7 @@
           <w14:ligatures w14:val="standardContextual"/>
         </w:rPr>
       </w:pPr>
-      <w:hyperlink w:anchor="_Toc238305820" w:history="1">
+      <w:hyperlink w:anchor="_Toc238318209" w:history="1">
         <w:r>
           <w:rPr>
             <w:rStyle w:val="Hyperlink"/>
@@ -6465,7 +6465,7 @@
             <w:noProof/>
             <w:webHidden/>
           </w:rPr>
-          <w:instrText xml:space="preserve"> PAGEREF _Toc238305820 \h </w:instrText>
+          <w:instrText xml:space="preserve"> PAGEREF _Toc238318209 \h </w:instrText>
         </w:r>
         <w:r>
           <w:rPr>
@@ -6511,7 +6511,7 @@
           <w14:ligatures w14:val="standardContextual"/>
         </w:rPr>
       </w:pPr>
-      <w:hyperlink w:anchor="_Toc238305821" w:history="1">
+      <w:hyperlink w:anchor="_Toc238318210" w:history="1">
         <w:r>
           <w:rPr>
             <w:rStyle w:val="Hyperlink"/>
@@ -6540,7 +6540,7 @@
             <w:noProof/>
             <w:webHidden/>
           </w:rPr>
-          <w:instrText xml:space="preserve"> PAGEREF _Toc238305821 \h </w:instrText>
+          <w:instrText xml:space="preserve"> PAGEREF _Toc238318210 \h </w:instrText>
         </w:r>
         <w:r>
           <w:rPr>
@@ -6586,7 +6586,7 @@
           <w14:ligatures w14:val="standardContextual"/>
         </w:rPr>
       </w:pPr>
-      <w:hyperlink w:anchor="_Toc238305822" w:history="1">
+      <w:hyperlink w:anchor="_Toc238318211" w:history="1">
         <w:r>
           <w:rPr>
             <w:rStyle w:val="Hyperlink"/>
@@ -6615,7 +6615,7 @@
             <w:noProof/>
             <w:webHidden/>
           </w:rPr>
-          <w:instrText xml:space="preserve"> PAGEREF _Toc238305822 \h </w:instrText>
+          <w:instrText xml:space="preserve"> PAGEREF _Toc238318211 \h </w:instrText>
         </w:r>
         <w:r>
           <w:rPr>
@@ -6661,7 +6661,7 @@
           <w14:ligatures w14:val="standardContextual"/>
         </w:rPr>
       </w:pPr>
-      <w:hyperlink w:anchor="_Toc238305823" w:history="1">
+      <w:hyperlink w:anchor="_Toc238318212" w:history="1">
         <w:r>
           <w:rPr>
             <w:rStyle w:val="Hyperlink"/>
@@ -6690,7 +6690,7 @@
             <w:noProof/>
             <w:webHidden/>
           </w:rPr>
-          <w:instrText xml:space="preserve"> PAGEREF _Toc238305823 \h </w:instrText>
+          <w:instrText xml:space="preserve"> PAGEREF _Toc238318212 \h </w:instrText>
         </w:r>
         <w:r>
           <w:rPr>
@@ -6736,7 +6736,7 @@
           <w14:ligatures w14:val="standardContextual"/>
         </w:rPr>
       </w:pPr>
-      <w:hyperlink w:anchor="_Toc238305824" w:history="1">
+      <w:hyperlink w:anchor="_Toc238318213" w:history="1">
         <w:r>
           <w:rPr>
             <w:rStyle w:val="Hyperlink"/>
@@ -6764,7 +6764,7 @@
             <w:noProof/>
             <w:webHidden/>
           </w:rPr>
-          <w:instrText xml:space="preserve"> PAGEREF _Toc238305824 \h </w:instrText>
+          <w:instrText xml:space="preserve"> PAGEREF _Toc238318213 \h </w:instrText>
         </w:r>
         <w:r>
           <w:rPr>
@@ -6810,7 +6810,7 @@
           <w14:ligatures w14:val="standardContextual"/>
         </w:rPr>
       </w:pPr>
-      <w:hyperlink w:anchor="_Toc238305825" w:history="1">
+      <w:hyperlink w:anchor="_Toc238318214" w:history="1">
         <w:r>
           <w:rPr>
             <w:rStyle w:val="Hyperlink"/>
@@ -6838,7 +6838,7 @@
             <w:noProof/>
             <w:webHidden/>
           </w:rPr>
-          <w:instrText xml:space="preserve"> PAGEREF _Toc238305825 \h </w:instrText>
+          <w:instrText xml:space="preserve"> PAGEREF _Toc238318214 \h </w:instrText>
         </w:r>
         <w:r>
           <w:rPr>
@@ -6884,7 +6884,7 @@
           <w14:ligatures w14:val="standardContextual"/>
         </w:rPr>
       </w:pPr>
-      <w:hyperlink w:anchor="_Toc238305826" w:history="1">
+      <w:hyperlink w:anchor="_Toc238318215" w:history="1">
         <w:r>
           <w:rPr>
             <w:rStyle w:val="Hyperlink"/>
@@ -6912,7 +6912,7 @@
             <w:noProof/>
             <w:webHidden/>
           </w:rPr>
-          <w:instrText xml:space="preserve"> PAGEREF _Toc238305826 \h </w:instrText>
+          <w:instrText xml:space="preserve"> PAGEREF _Toc238318215 \h </w:instrText>
         </w:r>
         <w:r>
           <w:rPr>
@@ -6958,7 +6958,7 @@
           <w14:ligatures w14:val="standardContextual"/>
         </w:rPr>
       </w:pPr>
-      <w:hyperlink w:anchor="_Toc238305827" w:history="1">
+      <w:hyperlink w:anchor="_Toc238318216" w:history="1">
         <w:r>
           <w:rPr>
             <w:rStyle w:val="Hyperlink"/>
@@ -6986,7 +6986,7 @@
             <w:noProof/>
             <w:webHidden/>
           </w:rPr>
-          <w:instrText xml:space="preserve"> PAGEREF _Toc238305827 \h </w:instrText>
+          <w:instrText xml:space="preserve"> PAGEREF _Toc238318216 \h </w:instrText>
         </w:r>
         <w:r>
           <w:rPr>
@@ -7032,7 +7032,7 @@
           <w14:ligatures w14:val="standardContextual"/>
         </w:rPr>
       </w:pPr>
-      <w:hyperlink w:anchor="_Toc238305828" w:history="1">
+      <w:hyperlink w:anchor="_Toc238318217" w:history="1">
         <w:r>
           <w:rPr>
             <w:rStyle w:val="Hyperlink"/>
@@ -7060,7 +7060,7 @@
             <w:noProof/>
             <w:webHidden/>
           </w:rPr>
-          <w:instrText xml:space="preserve"> PAGEREF _Toc238305828 \h </w:instrText>
+          <w:instrText xml:space="preserve"> PAGEREF _Toc238318217 \h </w:instrText>
         </w:r>
         <w:r>
           <w:rPr>
@@ -7106,7 +7106,7 @@
           <w14:ligatures w14:val="standardContextual"/>
         </w:rPr>
       </w:pPr>
-      <w:hyperlink w:anchor="_Toc238305829" w:history="1">
+      <w:hyperlink w:anchor="_Toc238318218" w:history="1">
         <w:r>
           <w:rPr>
             <w:rStyle w:val="Hyperlink"/>
@@ -7134,7 +7134,7 @@
             <w:noProof/>
             <w:webHidden/>
           </w:rPr>
-          <w:instrText xml:space="preserve"> PAGEREF _Toc238305829 \h </w:instrText>
+          <w:instrText xml:space="preserve"> PAGEREF _Toc238318218 \h </w:instrText>
         </w:r>
         <w:r>
           <w:rPr>
@@ -7180,7 +7180,7 @@
           <w14:ligatures w14:val="standardContextual"/>
         </w:rPr>
       </w:pPr>
-      <w:hyperlink w:anchor="_Toc238305830" w:history="1">
+      <w:hyperlink w:anchor="_Toc238318219" w:history="1">
         <w:r>
           <w:rPr>
             <w:rStyle w:val="Hyperlink"/>
@@ -7208,7 +7208,7 @@
             <w:noProof/>
             <w:webHidden/>
           </w:rPr>
-          <w:instrText xml:space="preserve"> PAGEREF _Toc238305830 \h </w:instrText>
+          <w:instrText xml:space="preserve"> PAGEREF _Toc238318219 \h </w:instrText>
         </w:r>
         <w:r>
           <w:rPr>
@@ -7254,7 +7254,7 @@
           <w14:ligatures w14:val="standardContextual"/>
         </w:rPr>
       </w:pPr>
-      <w:hyperlink w:anchor="_Toc238305831" w:history="1">
+      <w:hyperlink w:anchor="_Toc238318220" w:history="1">
         <w:r>
           <w:rPr>
             <w:rStyle w:val="Hyperlink"/>
@@ -7282,7 +7282,7 @@
             <w:noProof/>
             <w:webHidden/>
           </w:rPr>
-          <w:instrText xml:space="preserve"> PAGEREF _Toc238305831 \h </w:instrText>
+          <w:instrText xml:space="preserve"> PAGEREF _Toc238318220 \h </w:instrText>
         </w:r>
         <w:r>
           <w:rPr>
@@ -7328,7 +7328,7 @@
           <w14:ligatures w14:val="standardContextual"/>
         </w:rPr>
       </w:pPr>
-      <w:hyperlink w:anchor="_Toc238305832" w:history="1">
+      <w:hyperlink w:anchor="_Toc238318221" w:history="1">
         <w:r>
           <w:rPr>
             <w:rStyle w:val="Hyperlink"/>
@@ -7356,7 +7356,7 @@
             <w:noProof/>
             <w:webHidden/>
           </w:rPr>
-          <w:instrText xml:space="preserve"> PAGEREF _Toc238305832 \h </w:instrText>
+          <w:instrText xml:space="preserve"> PAGEREF _Toc238318221 \h </w:instrText>
         </w:r>
         <w:r>
           <w:rPr>
@@ -7402,7 +7402,7 @@
           <w14:ligatures w14:val="standardContextual"/>
         </w:rPr>
       </w:pPr>
-      <w:hyperlink w:anchor="_Toc238305833" w:history="1">
+      <w:hyperlink w:anchor="_Toc238318222" w:history="1">
         <w:r>
           <w:rPr>
             <w:rStyle w:val="Hyperlink"/>
@@ -7430,7 +7430,7 @@
             <w:noProof/>
             <w:webHidden/>
           </w:rPr>
-          <w:instrText xml:space="preserve"> PAGEREF _Toc238305833 \h </w:instrText>
+          <w:instrText xml:space="preserve"> PAGEREF _Toc238318222 \h </w:instrText>
         </w:r>
         <w:r>
           <w:rPr>
@@ -7476,7 +7476,7 @@
           <w14:ligatures w14:val="standardContextual"/>
         </w:rPr>
       </w:pPr>
-      <w:hyperlink w:anchor="_Toc238305834" w:history="1">
+      <w:hyperlink w:anchor="_Toc238318223" w:history="1">
         <w:r>
           <w:rPr>
             <w:rStyle w:val="Hyperlink"/>
@@ -7504,7 +7504,7 @@
             <w:noProof/>
             <w:webHidden/>
           </w:rPr>
-          <w:instrText xml:space="preserve"> PAGEREF _Toc238305834 \h </w:instrText>
+          <w:instrText xml:space="preserve"> PAGEREF _Toc238318223 \h </w:instrText>
         </w:r>
         <w:r>
           <w:rPr>
@@ -7550,7 +7550,7 @@
           <w14:ligatures w14:val="standardContextual"/>
         </w:rPr>
       </w:pPr>
-      <w:hyperlink w:anchor="_Toc238305835" w:history="1">
+      <w:hyperlink w:anchor="_Toc238318224" w:history="1">
         <w:r>
           <w:rPr>
             <w:rStyle w:val="Hyperlink"/>
@@ -7578,7 +7578,7 @@
             <w:noProof/>
             <w:webHidden/>
           </w:rPr>
-          <w:instrText xml:space="preserve"> PAGEREF _Toc238305835 \h </w:instrText>
+          <w:instrText xml:space="preserve"> PAGEREF _Toc238318224 \h </w:instrText>
         </w:r>
         <w:r>
           <w:rPr>
@@ -7624,7 +7624,7 @@
           <w14:ligatures w14:val="standardContextual"/>
         </w:rPr>
       </w:pPr>
-      <w:hyperlink w:anchor="_Toc238305836" w:history="1">
+      <w:hyperlink w:anchor="_Toc238318225" w:history="1">
         <w:r>
           <w:rPr>
             <w:rStyle w:val="Hyperlink"/>
@@ -7652,7 +7652,7 @@
             <w:noProof/>
             <w:webHidden/>
           </w:rPr>
-          <w:instrText xml:space="preserve"> PAGEREF _Toc238305836 \h </w:instrText>
+          <w:instrText xml:space="preserve"> PAGEREF _Toc238318225 \h </w:instrText>
         </w:r>
         <w:r>
           <w:rPr>
@@ -7698,7 +7698,7 @@
           <w14:ligatures w14:val="standardContextual"/>
         </w:rPr>
       </w:pPr>
-      <w:hyperlink w:anchor="_Toc238305837" w:history="1">
+      <w:hyperlink w:anchor="_Toc238318226" w:history="1">
         <w:r>
           <w:rPr>
             <w:rStyle w:val="Hyperlink"/>
@@ -7726,7 +7726,7 @@
             <w:noProof/>
             <w:webHidden/>
           </w:rPr>
-          <w:instrText xml:space="preserve"> PAGEREF _Toc238305837 \h </w:instrText>
+          <w:instrText xml:space="preserve"> PAGEREF _Toc238318226 \h </w:instrText>
         </w:r>
         <w:r>
           <w:rPr>
@@ -7772,7 +7772,7 @@
           <w14:ligatures w14:val="standardContextual"/>
         </w:rPr>
       </w:pPr>
-      <w:hyperlink w:anchor="_Toc238305838" w:history="1">
+      <w:hyperlink w:anchor="_Toc238318227" w:history="1">
         <w:r>
           <w:rPr>
             <w:rStyle w:val="Hyperlink"/>
@@ -7801,7 +7801,7 @@
             <w:noProof/>
             <w:webHidden/>
           </w:rPr>
-          <w:instrText xml:space="preserve"> PAGEREF _Toc238305838 \h </w:instrText>
+          <w:instrText xml:space="preserve"> PAGEREF _Toc238318227 \h </w:instrText>
         </w:r>
         <w:r>
           <w:rPr>
@@ -7847,7 +7847,7 @@
         <w:pageBreakBefore/>
         <w:spacing w:before="480" w:after="240"/>
       </w:pPr>
-      <w:bookmarkStart w:id="2" w:name="_Toc238305740"/>
+      <w:bookmarkStart w:id="2" w:name="_Toc238318129"/>
       <w:r>
         <w:rPr>
           <w:b/>
@@ -8038,7 +8038,7 @@
         <w:keepNext/>
         <w:spacing w:before="480" w:after="240"/>
       </w:pPr>
-      <w:bookmarkStart w:id="3" w:name="_Toc238305741"/>
+      <w:bookmarkStart w:id="3" w:name="_Toc238318130"/>
       <w:r>
         <w:rPr>
           <w:b/>
@@ -8063,7 +8063,7 @@
         <w:keepNext/>
         <w:spacing w:before="480" w:after="240"/>
       </w:pPr>
-      <w:bookmarkStart w:id="4" w:name="_Toc238305742"/>
+      <w:bookmarkStart w:id="4" w:name="_Toc238318131"/>
       <w:r>
         <w:rPr>
           <w:b/>
@@ -10098,7 +10098,7 @@
         <w:keepNext/>
         <w:spacing w:before="480" w:after="240"/>
       </w:pPr>
-      <w:bookmarkStart w:id="5" w:name="_Toc238305743"/>
+      <w:bookmarkStart w:id="5" w:name="_Toc238318132"/>
       <w:r>
         <w:rPr>
           <w:b/>
@@ -10126,7 +10126,7 @@
         <w:keepNext/>
         <w:spacing w:before="320" w:after="160"/>
       </w:pPr>
-      <w:bookmarkStart w:id="6" w:name="_Toc238305744"/>
+      <w:bookmarkStart w:id="6" w:name="_Toc238318133"/>
       <w:r>
         <w:rPr>
           <w:b/>
@@ -10169,7 +10169,7 @@
         <w:keepNext/>
         <w:spacing w:before="320" w:after="160"/>
       </w:pPr>
-      <w:bookmarkStart w:id="7" w:name="_Toc238305745"/>
+      <w:bookmarkStart w:id="7" w:name="_Toc238318134"/>
       <w:r>
         <w:rPr>
           <w:b/>
@@ -10236,7 +10236,7 @@
         <w:keepNext/>
         <w:spacing w:before="320" w:after="160"/>
       </w:pPr>
-      <w:bookmarkStart w:id="8" w:name="_Toc238305746"/>
+      <w:bookmarkStart w:id="8" w:name="_Toc238318135"/>
       <w:r>
         <w:rPr>
           <w:b/>
@@ -10277,7 +10277,7 @@
         <w:keepNext/>
         <w:spacing w:before="320" w:after="160"/>
       </w:pPr>
-      <w:bookmarkStart w:id="9" w:name="_Toc238305747"/>
+      <w:bookmarkStart w:id="9" w:name="_Toc238318136"/>
       <w:r>
         <w:rPr>
           <w:b/>
@@ -10325,7 +10325,7 @@
         <w:keepNext/>
         <w:spacing w:before="480" w:after="240"/>
       </w:pPr>
-      <w:bookmarkStart w:id="10" w:name="_Toc238305748"/>
+      <w:bookmarkStart w:id="10" w:name="_Toc238318137"/>
       <w:r>
         <w:rPr>
           <w:b/>
@@ -10353,7 +10353,7 @@
         <w:keepNext/>
         <w:spacing w:before="320" w:after="160"/>
       </w:pPr>
-      <w:bookmarkStart w:id="11" w:name="_Toc238305749"/>
+      <w:bookmarkStart w:id="11" w:name="_Toc238318138"/>
       <w:r>
         <w:rPr>
           <w:b/>
@@ -10408,7 +10408,7 @@
         <w:keepNext/>
         <w:spacing w:before="320" w:after="160"/>
       </w:pPr>
-      <w:bookmarkStart w:id="12" w:name="_Toc238305750"/>
+      <w:bookmarkStart w:id="12" w:name="_Toc238318139"/>
       <w:r>
         <w:rPr>
           <w:b/>
@@ -10455,7 +10455,7 @@
         <w:keepNext/>
         <w:spacing w:before="320" w:after="160"/>
       </w:pPr>
-      <w:bookmarkStart w:id="13" w:name="_Toc238305751"/>
+      <w:bookmarkStart w:id="13" w:name="_Toc238318140"/>
       <w:r>
         <w:rPr>
           <w:b/>
@@ -10498,7 +10498,7 @@
         <w:keepNext/>
         <w:spacing w:before="320" w:after="160"/>
       </w:pPr>
-      <w:bookmarkStart w:id="14" w:name="_Toc238305752"/>
+      <w:bookmarkStart w:id="14" w:name="_Toc238318141"/>
       <w:r>
         <w:rPr>
           <w:b/>
@@ -10541,7 +10541,7 @@
         <w:keepNext/>
         <w:spacing w:before="320" w:after="160"/>
       </w:pPr>
-      <w:bookmarkStart w:id="15" w:name="_Toc238305753"/>
+      <w:bookmarkStart w:id="15" w:name="_Toc238318142"/>
       <w:r>
         <w:rPr>
           <w:b/>
@@ -10578,7 +10578,7 @@
         <w:keepNext/>
         <w:spacing w:before="480" w:after="240"/>
       </w:pPr>
-      <w:bookmarkStart w:id="16" w:name="_Toc238305754"/>
+      <w:bookmarkStart w:id="16" w:name="_Toc238318143"/>
       <w:r>
         <w:rPr>
           <w:b/>
@@ -10606,7 +10606,7 @@
         <w:keepNext/>
         <w:spacing w:before="320" w:after="160"/>
       </w:pPr>
-      <w:bookmarkStart w:id="17" w:name="_Toc238305755"/>
+      <w:bookmarkStart w:id="17" w:name="_Toc238318144"/>
       <w:r>
         <w:rPr>
           <w:b/>
@@ -10637,7 +10637,7 @@
         <w:keepNext/>
         <w:spacing w:before="320" w:after="160"/>
       </w:pPr>
-      <w:bookmarkStart w:id="18" w:name="_Toc238305756"/>
+      <w:bookmarkStart w:id="18" w:name="_Toc238318145"/>
       <w:r>
         <w:rPr>
           <w:b/>
@@ -10683,7 +10683,7 @@
         <w:keepNext/>
         <w:spacing w:before="320" w:after="160"/>
       </w:pPr>
-      <w:bookmarkStart w:id="19" w:name="_Toc238305757"/>
+      <w:bookmarkStart w:id="19" w:name="_Toc238318146"/>
       <w:r>
         <w:rPr>
           <w:b/>
@@ -11746,7 +11746,7 @@
         <w:keepNext/>
         <w:spacing w:before="320" w:after="160"/>
       </w:pPr>
-      <w:bookmarkStart w:id="20" w:name="_Toc238305758"/>
+      <w:bookmarkStart w:id="20" w:name="_Toc238318147"/>
       <w:r>
         <w:rPr>
           <w:b/>
@@ -11777,7 +11777,7 @@
         <w:keepNext/>
         <w:spacing w:before="320" w:after="160"/>
       </w:pPr>
-      <w:bookmarkStart w:id="21" w:name="_Toc238305759"/>
+      <w:bookmarkStart w:id="21" w:name="_Toc238318148"/>
       <w:r>
         <w:rPr>
           <w:b/>
@@ -11832,7 +11832,7 @@
         <w:keepNext/>
         <w:spacing w:before="320" w:after="160"/>
       </w:pPr>
-      <w:bookmarkStart w:id="22" w:name="_Toc238305760"/>
+      <w:bookmarkStart w:id="22" w:name="_Toc238318149"/>
       <w:r>
         <w:rPr>
           <w:b/>
@@ -12559,7 +12559,7 @@
         <w:keepNext/>
         <w:spacing w:before="320" w:after="160"/>
       </w:pPr>
-      <w:bookmarkStart w:id="23" w:name="_Toc238305761"/>
+      <w:bookmarkStart w:id="23" w:name="_Toc238318150"/>
       <w:r>
         <w:rPr>
           <w:b/>
@@ -12595,7 +12595,7 @@
         <w:keepNext/>
         <w:spacing w:before="480" w:after="240"/>
       </w:pPr>
-      <w:bookmarkStart w:id="24" w:name="_Toc238305762"/>
+      <w:bookmarkStart w:id="24" w:name="_Toc238318151"/>
       <w:r>
         <w:rPr>
           <w:b/>
@@ -12623,7 +12623,7 @@
         <w:keepNext/>
         <w:spacing w:before="320" w:after="160"/>
       </w:pPr>
-      <w:bookmarkStart w:id="25" w:name="_Toc238305763"/>
+      <w:bookmarkStart w:id="25" w:name="_Toc238318152"/>
       <w:r>
         <w:rPr>
           <w:b/>
@@ -12663,7 +12663,7 @@
         <w:keepNext/>
         <w:spacing w:before="320" w:after="160"/>
       </w:pPr>
-      <w:bookmarkStart w:id="26" w:name="_Toc238305764"/>
+      <w:bookmarkStart w:id="26" w:name="_Toc238318153"/>
       <w:r>
         <w:rPr>
           <w:b/>
@@ -12794,7 +12794,7 @@
         <w:keepNext/>
         <w:spacing w:before="320" w:after="160"/>
       </w:pPr>
-      <w:bookmarkStart w:id="27" w:name="_Toc238305765"/>
+      <w:bookmarkStart w:id="27" w:name="_Toc238318154"/>
       <w:r>
         <w:rPr>
           <w:b/>
@@ -12826,7 +12826,7 @@
         <w:keepNext/>
         <w:spacing w:before="320" w:after="160"/>
       </w:pPr>
-      <w:bookmarkStart w:id="28" w:name="_Toc238305766"/>
+      <w:bookmarkStart w:id="28" w:name="_Toc238318155"/>
       <w:r>
         <w:rPr>
           <w:b/>
@@ -12911,7 +12911,7 @@
         <w:keepNext/>
         <w:spacing w:before="320" w:after="160"/>
       </w:pPr>
-      <w:bookmarkStart w:id="29" w:name="_Toc238305767"/>
+      <w:bookmarkStart w:id="29" w:name="_Toc238318156"/>
       <w:r>
         <w:rPr>
           <w:b/>
@@ -13023,7 +13023,7 @@
         <w:keepNext/>
         <w:spacing w:before="360" w:after="120"/>
       </w:pPr>
-      <w:bookmarkStart w:id="30" w:name="_Toc238305768"/>
+      <w:bookmarkStart w:id="30" w:name="_Toc238318157"/>
       <w:r>
         <w:rPr>
           <w:b/>
@@ -13040,7 +13040,7 @@
         <w:keepNext/>
         <w:spacing w:before="280" w:after="100"/>
       </w:pPr>
-      <w:bookmarkStart w:id="31" w:name="_Toc238305769"/>
+      <w:bookmarkStart w:id="31" w:name="_Toc238318158"/>
       <w:r>
         <w:rPr>
           <w:b/>
@@ -13082,7 +13082,7 @@
         <w:keepNext/>
         <w:spacing w:before="280" w:after="100"/>
       </w:pPr>
-      <w:bookmarkStart w:id="32" w:name="_Toc238305770"/>
+      <w:bookmarkStart w:id="32" w:name="_Toc238318159"/>
       <w:r>
         <w:rPr>
           <w:b/>
@@ -13124,7 +13124,7 @@
         <w:keepNext/>
         <w:spacing w:before="280" w:after="100"/>
       </w:pPr>
-      <w:bookmarkStart w:id="33" w:name="_Toc238305771"/>
+      <w:bookmarkStart w:id="33" w:name="_Toc238318160"/>
       <w:r>
         <w:rPr>
           <w:b/>
@@ -13798,7 +13798,7 @@
           <w:noProof/>
         </w:rPr>
         <w:drawing>
-          <wp:inline distT="0" distB="0" distL="0" distR="0" wp14:anchorId="50BB916D" wp14:editId="46C6E1D5">
+          <wp:inline distT="0" distB="0" distL="0" distR="0" wp14:anchorId="4FAFF765" wp14:editId="2CB2AED7">
             <wp:extent cx="5669280" cy="1144783"/>
             <wp:effectExtent l="0" t="0" r="0" b="0"/>
             <wp:docPr id="1" name="Picture 1"/>
@@ -13849,7 +13849,7 @@
         <w:keepNext/>
         <w:spacing w:before="280" w:after="100"/>
       </w:pPr>
-      <w:bookmarkStart w:id="34" w:name="_Toc238305772"/>
+      <w:bookmarkStart w:id="34" w:name="_Toc238318161"/>
       <w:r>
         <w:rPr>
           <w:b/>
@@ -15010,7 +15010,7 @@
         <w:keepNext/>
         <w:spacing w:before="280" w:after="100"/>
       </w:pPr>
-      <w:bookmarkStart w:id="35" w:name="_Toc238305773"/>
+      <w:bookmarkStart w:id="35" w:name="_Toc238318162"/>
       <w:r>
         <w:rPr>
           <w:b/>
@@ -15056,7 +15056,7 @@
         <w:keepNext/>
         <w:spacing w:before="280" w:after="100"/>
       </w:pPr>
-      <w:bookmarkStart w:id="36" w:name="_Toc238305774"/>
+      <w:bookmarkStart w:id="36" w:name="_Toc238318163"/>
       <w:r>
         <w:rPr>
           <w:b/>
@@ -15725,7 +15725,7 @@
         <w:keepNext/>
         <w:spacing w:before="280" w:after="100"/>
       </w:pPr>
-      <w:bookmarkStart w:id="37" w:name="_Toc238305775"/>
+      <w:bookmarkStart w:id="37" w:name="_Toc238318164"/>
       <w:r>
         <w:rPr>
           <w:b/>
@@ -15818,7 +15818,7 @@
         <w:keepNext/>
         <w:spacing w:before="280" w:after="100"/>
       </w:pPr>
-      <w:bookmarkStart w:id="38" w:name="_Toc238305776"/>
+      <w:bookmarkStart w:id="38" w:name="_Toc238318165"/>
       <w:r>
         <w:rPr>
           <w:b/>
@@ -15860,7 +15860,7 @@
         <w:keepNext/>
         <w:spacing w:before="480" w:after="240"/>
       </w:pPr>
-      <w:bookmarkStart w:id="39" w:name="_Toc238305777"/>
+      <w:bookmarkStart w:id="39" w:name="_Toc238318166"/>
       <w:r>
         <w:rPr>
           <w:b/>
@@ -15887,7 +15887,7 @@
         <w:keepNext/>
         <w:spacing w:before="320" w:after="160"/>
       </w:pPr>
-      <w:bookmarkStart w:id="40" w:name="_Toc238305778"/>
+      <w:bookmarkStart w:id="40" w:name="_Toc238318167"/>
       <w:r>
         <w:rPr>
           <w:b/>
@@ -16739,7 +16739,7 @@
         <w:keepNext/>
         <w:spacing w:before="320" w:after="160"/>
       </w:pPr>
-      <w:bookmarkStart w:id="41" w:name="_Toc238305779"/>
+      <w:bookmarkStart w:id="41" w:name="_Toc238318168"/>
       <w:r>
         <w:rPr>
           <w:b/>
@@ -16829,7 +16829,7 @@
         <w:keepNext/>
         <w:spacing w:before="320" w:after="160"/>
       </w:pPr>
-      <w:bookmarkStart w:id="42" w:name="_Toc238305780"/>
+      <w:bookmarkStart w:id="42" w:name="_Toc238318169"/>
       <w:r>
         <w:rPr>
           <w:b/>
@@ -16860,7 +16860,7 @@
         <w:keepNext/>
         <w:spacing w:before="320" w:after="160"/>
       </w:pPr>
-      <w:bookmarkStart w:id="43" w:name="_Toc238305781"/>
+      <w:bookmarkStart w:id="43" w:name="_Toc238318170"/>
       <w:r>
         <w:rPr>
           <w:b/>
@@ -16896,7 +16896,7 @@
         <w:keepNext/>
         <w:spacing w:before="480" w:after="240"/>
       </w:pPr>
-      <w:bookmarkStart w:id="44" w:name="_Toc238305782"/>
+      <w:bookmarkStart w:id="44" w:name="_Toc238318171"/>
       <w:r>
         <w:rPr>
           <w:b/>
@@ -16965,7 +16965,7 @@
         <w:keepNext/>
         <w:spacing w:before="480" w:after="240"/>
       </w:pPr>
-      <w:bookmarkStart w:id="45" w:name="_Toc238305783"/>
+      <w:bookmarkStart w:id="45" w:name="_Toc238318172"/>
       <w:r>
         <w:rPr>
           <w:b/>
@@ -16993,7 +16993,7 @@
         <w:keepNext/>
         <w:spacing w:before="320" w:after="160"/>
       </w:pPr>
-      <w:bookmarkStart w:id="46" w:name="_Toc238305784"/>
+      <w:bookmarkStart w:id="46" w:name="_Toc238318173"/>
       <w:r>
         <w:rPr>
           <w:b/>
@@ -17033,7 +17033,7 @@
         <w:keepNext/>
         <w:spacing w:before="320" w:after="160"/>
       </w:pPr>
-      <w:bookmarkStart w:id="47" w:name="_Toc238305785"/>
+      <w:bookmarkStart w:id="47" w:name="_Toc238318174"/>
       <w:r>
         <w:rPr>
           <w:b/>
@@ -17113,7 +17113,7 @@
         <w:keepNext/>
         <w:spacing w:before="480" w:after="240"/>
       </w:pPr>
-      <w:bookmarkStart w:id="48" w:name="_Toc238305786"/>
+      <w:bookmarkStart w:id="48" w:name="_Toc238318175"/>
       <w:r>
         <w:rPr>
           <w:b/>
@@ -17141,7 +17141,7 @@
         <w:keepNext/>
         <w:spacing w:before="320" w:after="160"/>
       </w:pPr>
-      <w:bookmarkStart w:id="49" w:name="_Toc238305787"/>
+      <w:bookmarkStart w:id="49" w:name="_Toc238318176"/>
       <w:r>
         <w:rPr>
           <w:b/>
@@ -17184,7 +17184,7 @@
         <w:keepNext/>
         <w:spacing w:before="320" w:after="160"/>
       </w:pPr>
-      <w:bookmarkStart w:id="50" w:name="_Toc238305788"/>
+      <w:bookmarkStart w:id="50" w:name="_Toc238318177"/>
       <w:r>
         <w:rPr>
           <w:b/>
@@ -18019,7 +18019,7 @@
         <w:keepNext/>
         <w:spacing w:before="320" w:after="160"/>
       </w:pPr>
-      <w:bookmarkStart w:id="51" w:name="_Toc238305789"/>
+      <w:bookmarkStart w:id="51" w:name="_Toc238318178"/>
       <w:r>
         <w:rPr>
           <w:b/>
@@ -18076,7 +18076,7 @@
         <w:keepNext/>
         <w:spacing w:before="480" w:after="240"/>
       </w:pPr>
-      <w:bookmarkStart w:id="52" w:name="_Toc238305790"/>
+      <w:bookmarkStart w:id="52" w:name="_Toc238318179"/>
       <w:r>
         <w:rPr>
           <w:b/>
@@ -18104,7 +18104,7 @@
         <w:keepNext/>
         <w:spacing w:before="320" w:after="160"/>
       </w:pPr>
-      <w:bookmarkStart w:id="53" w:name="_Toc238305791"/>
+      <w:bookmarkStart w:id="53" w:name="_Toc238318180"/>
       <w:r>
         <w:rPr>
           <w:b/>
@@ -18147,7 +18147,7 @@
         <w:keepNext/>
         <w:spacing w:before="320" w:after="160"/>
       </w:pPr>
-      <w:bookmarkStart w:id="54" w:name="_Toc238305792"/>
+      <w:bookmarkStart w:id="54" w:name="_Toc238318181"/>
       <w:r>
         <w:rPr>
           <w:b/>
@@ -18831,7 +18831,7 @@
         <w:keepNext/>
         <w:spacing w:before="320" w:after="160"/>
       </w:pPr>
-      <w:bookmarkStart w:id="55" w:name="_Toc238305793"/>
+      <w:bookmarkStart w:id="55" w:name="_Toc238318182"/>
       <w:r>
         <w:rPr>
           <w:b/>
@@ -18875,7 +18875,7 @@
         <w:keepNext/>
         <w:spacing w:before="320" w:after="160"/>
       </w:pPr>
-      <w:bookmarkStart w:id="56" w:name="_Toc238305794"/>
+      <w:bookmarkStart w:id="56" w:name="_Toc238318183"/>
       <w:r>
         <w:rPr>
           <w:b/>
@@ -18903,7 +18903,7 @@
         <w:keepNext/>
         <w:spacing w:before="320" w:after="160"/>
       </w:pPr>
-      <w:bookmarkStart w:id="57" w:name="_Toc238305795"/>
+      <w:bookmarkStart w:id="57" w:name="_Toc238318184"/>
       <w:r>
         <w:rPr>
           <w:b/>
@@ -18967,7 +18967,7 @@
         <w:keepNext/>
         <w:spacing w:before="320" w:after="160"/>
       </w:pPr>
-      <w:bookmarkStart w:id="58" w:name="_Toc238305796"/>
+      <w:bookmarkStart w:id="58" w:name="_Toc238318185"/>
       <w:r>
         <w:rPr>
           <w:b/>
@@ -19009,7 +19009,7 @@
         <w:keepNext/>
         <w:spacing w:before="480" w:after="240"/>
       </w:pPr>
-      <w:bookmarkStart w:id="59" w:name="_Toc238305797"/>
+      <w:bookmarkStart w:id="59" w:name="_Toc238318186"/>
       <w:r>
         <w:rPr>
           <w:b/>
@@ -19037,7 +19037,7 @@
         <w:keepNext/>
         <w:spacing w:before="320" w:after="160"/>
       </w:pPr>
-      <w:bookmarkStart w:id="60" w:name="_Toc238305798"/>
+      <w:bookmarkStart w:id="60" w:name="_Toc238318187"/>
       <w:r>
         <w:rPr>
           <w:b/>
@@ -19178,7 +19178,7 @@
         <w:keepNext/>
         <w:spacing w:before="320" w:after="160"/>
       </w:pPr>
-      <w:bookmarkStart w:id="61" w:name="_Toc238305799"/>
+      <w:bookmarkStart w:id="61" w:name="_Toc238318188"/>
       <w:r>
         <w:rPr>
           <w:b/>
@@ -19209,7 +19209,7 @@
         <w:keepNext/>
         <w:spacing w:before="320" w:after="160"/>
       </w:pPr>
-      <w:bookmarkStart w:id="62" w:name="_Toc238305800"/>
+      <w:bookmarkStart w:id="62" w:name="_Toc238318189"/>
       <w:r>
         <w:rPr>
           <w:b/>
@@ -19258,7 +19258,7 @@
         <w:keepNext/>
         <w:spacing w:before="480" w:after="240"/>
       </w:pPr>
-      <w:bookmarkStart w:id="63" w:name="_Toc238305801"/>
+      <w:bookmarkStart w:id="63" w:name="_Toc238318190"/>
       <w:r>
         <w:rPr>
           <w:b/>
@@ -19286,7 +19286,7 @@
         <w:keepNext/>
         <w:spacing w:before="320" w:after="160"/>
       </w:pPr>
-      <w:bookmarkStart w:id="64" w:name="_Toc238305802"/>
+      <w:bookmarkStart w:id="64" w:name="_Toc238318191"/>
       <w:r>
         <w:rPr>
           <w:b/>
@@ -19329,7 +19329,7 @@
         <w:keepNext/>
         <w:spacing w:before="320" w:after="160"/>
       </w:pPr>
-      <w:bookmarkStart w:id="65" w:name="_Toc238305803"/>
+      <w:bookmarkStart w:id="65" w:name="_Toc238318192"/>
       <w:r>
         <w:rPr>
           <w:b/>
@@ -19360,7 +19360,7 @@
         <w:keepNext/>
         <w:spacing w:before="320" w:after="160"/>
       </w:pPr>
-      <w:bookmarkStart w:id="66" w:name="_Toc238305804"/>
+      <w:bookmarkStart w:id="66" w:name="_Toc238318193"/>
       <w:r>
         <w:rPr>
           <w:b/>
@@ -19391,7 +19391,7 @@
         <w:keepNext/>
         <w:spacing w:before="320" w:after="160"/>
       </w:pPr>
-      <w:bookmarkStart w:id="67" w:name="_Toc238305805"/>
+      <w:bookmarkStart w:id="67" w:name="_Toc238318194"/>
       <w:r>
         <w:rPr>
           <w:b/>
@@ -19440,7 +19440,7 @@
         <w:keepNext/>
         <w:spacing w:before="480" w:after="240"/>
       </w:pPr>
-      <w:bookmarkStart w:id="68" w:name="_Toc238305806"/>
+      <w:bookmarkStart w:id="68" w:name="_Toc238318195"/>
       <w:r>
         <w:rPr>
           <w:b/>
@@ -19468,7 +19468,7 @@
         <w:keepNext/>
         <w:spacing w:before="320" w:after="160"/>
       </w:pPr>
-      <w:bookmarkStart w:id="69" w:name="_Toc238305807"/>
+      <w:bookmarkStart w:id="69" w:name="_Toc238318196"/>
       <w:r>
         <w:rPr>
           <w:b/>
@@ -19523,7 +19523,7 @@
         <w:keepNext/>
         <w:spacing w:before="320" w:after="160"/>
       </w:pPr>
-      <w:bookmarkStart w:id="70" w:name="_Toc238305808"/>
+      <w:bookmarkStart w:id="70" w:name="_Toc238318197"/>
       <w:r>
         <w:rPr>
           <w:b/>
@@ -19551,7 +19551,7 @@
         <w:keepNext/>
         <w:spacing w:before="240" w:after="120"/>
       </w:pPr>
-      <w:bookmarkStart w:id="71" w:name="_Toc238305809"/>
+      <w:bookmarkStart w:id="71" w:name="_Toc238318198"/>
       <w:r>
         <w:rPr>
           <w:b/>
@@ -19593,7 +19593,7 @@
         <w:keepNext/>
         <w:spacing w:before="240" w:after="120"/>
       </w:pPr>
-      <w:bookmarkStart w:id="72" w:name="_Toc238305810"/>
+      <w:bookmarkStart w:id="72" w:name="_Toc238318199"/>
       <w:r>
         <w:rPr>
           <w:b/>
@@ -19622,7 +19622,7 @@
         <w:keepNext/>
         <w:spacing w:before="240" w:after="120"/>
       </w:pPr>
-      <w:bookmarkStart w:id="73" w:name="_Toc238305811"/>
+      <w:bookmarkStart w:id="73" w:name="_Toc238318200"/>
       <w:r>
         <w:rPr>
           <w:b/>
@@ -19651,7 +19651,7 @@
         <w:keepNext/>
         <w:spacing w:before="320" w:after="160"/>
       </w:pPr>
-      <w:bookmarkStart w:id="74" w:name="_Toc238305812"/>
+      <w:bookmarkStart w:id="74" w:name="_Toc238318201"/>
       <w:r>
         <w:rPr>
           <w:b/>
@@ -19703,7 +19703,7 @@
         <w:keepNext/>
         <w:spacing w:before="240" w:after="120"/>
       </w:pPr>
-      <w:bookmarkStart w:id="75" w:name="_Toc238305813"/>
+      <w:bookmarkStart w:id="75" w:name="_Toc238318202"/>
       <w:r>
         <w:rPr>
           <w:b/>
@@ -20661,7 +20661,7 @@
         <w:keepNext/>
         <w:spacing w:before="240" w:after="120"/>
       </w:pPr>
-      <w:bookmarkStart w:id="76" w:name="_Toc238305814"/>
+      <w:bookmarkStart w:id="76" w:name="_Toc238318203"/>
       <w:r>
         <w:rPr>
           <w:b/>
@@ -20708,7 +20708,7 @@
         <w:keepNext/>
         <w:spacing w:before="240" w:after="120"/>
       </w:pPr>
-      <w:bookmarkStart w:id="77" w:name="_Toc238305815"/>
+      <w:bookmarkStart w:id="77" w:name="_Toc238318204"/>
       <w:r>
         <w:rPr>
           <w:b/>
@@ -21534,7 +21534,7 @@
         <w:keepNext/>
         <w:spacing w:before="240" w:after="120"/>
       </w:pPr>
-      <w:bookmarkStart w:id="78" w:name="_Toc238305816"/>
+      <w:bookmarkStart w:id="78" w:name="_Toc238318205"/>
       <w:r>
         <w:rPr>
           <w:b/>
@@ -21563,7 +21563,7 @@
         <w:keepNext/>
         <w:spacing w:before="320" w:after="160"/>
       </w:pPr>
-      <w:bookmarkStart w:id="79" w:name="_Toc238305817"/>
+      <w:bookmarkStart w:id="79" w:name="_Toc238318206"/>
       <w:r>
         <w:rPr>
           <w:b/>
@@ -21594,7 +21594,7 @@
         <w:keepNext/>
         <w:spacing w:before="320" w:after="160"/>
       </w:pPr>
-      <w:bookmarkStart w:id="80" w:name="_Toc238305818"/>
+      <w:bookmarkStart w:id="80" w:name="_Toc238318207"/>
       <w:r>
         <w:rPr>
           <w:b/>
@@ -21635,7 +21635,7 @@
         <w:keepNext/>
         <w:spacing w:before="320" w:after="160"/>
       </w:pPr>
-      <w:bookmarkStart w:id="81" w:name="_Toc238305819"/>
+      <w:bookmarkStart w:id="81" w:name="_Toc238318208"/>
       <w:r>
         <w:rPr>
           <w:b/>
@@ -22321,7 +22321,7 @@
         <w:keepNext/>
         <w:spacing w:before="320" w:after="160"/>
       </w:pPr>
-      <w:bookmarkStart w:id="82" w:name="_Toc238305820"/>
+      <w:bookmarkStart w:id="82" w:name="_Toc238318209"/>
       <w:r>
         <w:rPr>
           <w:b/>
@@ -24398,7 +24398,7 @@
         <w:keepNext/>
         <w:spacing w:before="320" w:after="160"/>
       </w:pPr>
-      <w:bookmarkStart w:id="83" w:name="_Toc238305821"/>
+      <w:bookmarkStart w:id="83" w:name="_Toc238318210"/>
       <w:r>
         <w:rPr>
           <w:b/>
@@ -24438,7 +24438,7 @@
         <w:keepNext/>
         <w:spacing w:before="320" w:after="160"/>
       </w:pPr>
-      <w:bookmarkStart w:id="84" w:name="_Toc238305822"/>
+      <w:bookmarkStart w:id="84" w:name="_Toc238318211"/>
       <w:r>
         <w:rPr>
           <w:b/>
@@ -24482,7 +24482,7 @@
         <w:keepNext/>
         <w:spacing w:before="320" w:after="160"/>
       </w:pPr>
-      <w:bookmarkStart w:id="85" w:name="_Toc238305823"/>
+      <w:bookmarkStart w:id="85" w:name="_Toc238318212"/>
       <w:r>
         <w:rPr>
           <w:b/>
@@ -24530,7 +24530,7 @@
         <w:keepNext/>
         <w:spacing w:before="480" w:after="240"/>
       </w:pPr>
-      <w:bookmarkStart w:id="86" w:name="_Toc238305824"/>
+      <w:bookmarkStart w:id="86" w:name="_Toc238318213"/>
       <w:r>
         <w:rPr>
           <w:b/>
@@ -24547,7 +24547,7 @@
         <w:keepNext/>
         <w:spacing w:before="360" w:after="120"/>
       </w:pPr>
-      <w:bookmarkStart w:id="87" w:name="_Toc238305825"/>
+      <w:bookmarkStart w:id="87" w:name="_Toc238318214"/>
       <w:r>
         <w:rPr>
           <w:b/>
@@ -24584,7 +24584,7 @@
         <w:keepNext/>
         <w:spacing w:before="360" w:after="120"/>
       </w:pPr>
-      <w:bookmarkStart w:id="88" w:name="_Toc238305826"/>
+      <w:bookmarkStart w:id="88" w:name="_Toc238318215"/>
       <w:r>
         <w:rPr>
           <w:b/>
@@ -26110,7 +26110,7 @@
         <w:keepNext/>
         <w:spacing w:before="360" w:after="120"/>
       </w:pPr>
-      <w:bookmarkStart w:id="89" w:name="_Toc238305827"/>
+      <w:bookmarkStart w:id="89" w:name="_Toc238318216"/>
       <w:r>
         <w:rPr>
           <w:b/>
@@ -26826,7 +26826,7 @@
         <w:keepNext/>
         <w:spacing w:before="360" w:after="120"/>
       </w:pPr>
-      <w:bookmarkStart w:id="90" w:name="_Toc238305828"/>
+      <w:bookmarkStart w:id="90" w:name="_Toc238318217"/>
       <w:r>
         <w:rPr>
           <w:b/>
@@ -26869,7 +26869,7 @@
         <w:keepNext/>
         <w:spacing w:before="360" w:after="120"/>
       </w:pPr>
-      <w:bookmarkStart w:id="91" w:name="_Toc238305829"/>
+      <w:bookmarkStart w:id="91" w:name="_Toc238318218"/>
       <w:r>
         <w:rPr>
           <w:b/>
@@ -27782,7 +27782,7 @@
         <w:keepNext/>
         <w:spacing w:before="360" w:after="120"/>
       </w:pPr>
-      <w:bookmarkStart w:id="92" w:name="_Toc238305830"/>
+      <w:bookmarkStart w:id="92" w:name="_Toc238318219"/>
       <w:r>
         <w:rPr>
           <w:b/>
@@ -27865,7 +27865,7 @@
         <w:keepNext/>
         <w:spacing w:before="480" w:after="240"/>
       </w:pPr>
-      <w:bookmarkStart w:id="93" w:name="_Toc238305831"/>
+      <w:bookmarkStart w:id="93" w:name="_Toc238318220"/>
       <w:r>
         <w:rPr>
           <w:b/>
@@ -27882,7 +27882,7 @@
         <w:keepNext/>
         <w:spacing w:before="360" w:after="120"/>
       </w:pPr>
-      <w:bookmarkStart w:id="94" w:name="_Toc238305832"/>
+      <w:bookmarkStart w:id="94" w:name="_Toc238318221"/>
       <w:r>
         <w:rPr>
           <w:b/>
@@ -27916,7 +27916,7 @@
         <w:keepNext/>
         <w:spacing w:before="360" w:after="120"/>
       </w:pPr>
-      <w:bookmarkStart w:id="95" w:name="_Toc238305833"/>
+      <w:bookmarkStart w:id="95" w:name="_Toc238318222"/>
       <w:r>
         <w:rPr>
           <w:b/>
@@ -27956,7 +27956,7 @@
         <w:keepNext/>
         <w:spacing w:before="360" w:after="120"/>
       </w:pPr>
-      <w:bookmarkStart w:id="96" w:name="_Toc238305834"/>
+      <w:bookmarkStart w:id="96" w:name="_Toc238318223"/>
       <w:r>
         <w:rPr>
           <w:b/>
@@ -27990,7 +27990,7 @@
         <w:keepNext/>
         <w:spacing w:before="360" w:after="120"/>
       </w:pPr>
-      <w:bookmarkStart w:id="97" w:name="_Toc238305835"/>
+      <w:bookmarkStart w:id="97" w:name="_Toc238318224"/>
       <w:r>
         <w:rPr>
           <w:b/>
@@ -28447,7 +28447,7 @@
         <w:keepNext/>
         <w:spacing w:before="360" w:after="120"/>
       </w:pPr>
-      <w:bookmarkStart w:id="98" w:name="_Toc238305836"/>
+      <w:bookmarkStart w:id="98" w:name="_Toc238318225"/>
       <w:r>
         <w:rPr>
           <w:b/>
@@ -29252,7 +29252,7 @@
         <w:keepNext/>
         <w:spacing w:before="360" w:after="120"/>
       </w:pPr>
-      <w:bookmarkStart w:id="99" w:name="_Toc238305837"/>
+      <w:bookmarkStart w:id="99" w:name="_Toc238318226"/>
       <w:r>
         <w:rPr>
           <w:b/>
@@ -29950,7 +29950,7 @@
         <w:keepNext/>
         <w:spacing w:before="480" w:after="240"/>
       </w:pPr>
-      <w:bookmarkStart w:id="100" w:name="_Toc238305838"/>
+      <w:bookmarkStart w:id="100" w:name="_Toc238318227"/>
       <w:r>
         <w:rPr>
           <w:b/>
@@ -30612,10 +30612,10 @@
 <file path=word/numbering.xml><?xml version="1.0" encoding="utf-8"?>
 <w:numbering xmlns:wpc="http://schemas.microsoft.com/office/word/2010/wordprocessingCanvas" xmlns:cx="http://schemas.microsoft.com/office/drawing/2014/chartex" xmlns:cx1="http://schemas.microsoft.com/office/drawing/2015/9/8/chartex" xmlns:cx2="http://schemas.microsoft.com/office/drawing/2015/10/21/chartex" xmlns:cx3="http://schemas.microsoft.com/office/drawing/2016/5/9/chartex" xmlns:cx4="http://schemas.microsoft.com/office/drawing/2016/5/10/chartex" xmlns:cx5="http://schemas.microsoft.com/office/drawing/2016/5/11/chartex" xmlns:cx6="http://schemas.microsoft.com/office/drawing/2016/5/12/chartex" xmlns:cx7="http://schemas.microsoft.com/office/drawing/2016/5/13/chartex" xmlns:cx8="http://schemas.microsoft.com/office/drawing/2016/5/14/chartex" xmlns:mc="http://schemas.openxmlformats.org/markup-compatibility/2006" xmlns:aink="http://schemas.microsoft.com/office/drawing/2016/ink" xmlns:am3d="http://schemas.microsoft.com/office/drawing/2017/model3d" xmlns:o="urn:schemas-microsoft-com:office:office" xmlns:oel="http://schemas.microsoft.com/office/2019/extlst" xmlns:r="http://schemas.openxmlformats.org/officeDocument/2006/relationships" xmlns:m="http://schemas.openxmlformats.org/officeDocument/2006/math" xmlns:v="urn:schemas-microsoft-com:vml" xmlns:wp14="http://schemas.microsoft.com/office/word/2010/wordprocessingDrawing" xmlns:wp="http://schemas.openxmlformats.org/drawingml/2006/wordprocessingDrawing" xmlns:w10="urn:schemas-microsoft-com:office:word" xmlns:w="http://schemas.openxmlformats.org/wordprocessingml/2006/main" xmlns:w14="http://schemas.microsoft.com/office/word/2010/wordml" xmlns:w15="http://schemas.microsoft.com/office/word/2012/wordml" xmlns:w16cex="http://schemas.microsoft.com/office/word/2018/wordml/cex" xmlns:w16cid="http://schemas.microsoft.com/office/word/2016/wordml/cid" xmlns:w16="http://schemas.microsoft.com/office/word/2018/wordml" xmlns:w16du="http://schemas.microsoft.com/office/word/2023/wordml/word16du" xmlns:w16sdtdh="http://schemas.microsoft.com/office/word/2020/wordml/sdtdatahash" xmlns:w16sdtfl="http://schemas.microsoft.com/office/word/2024/wordml/sdtformatlock" xmlns:w16se="http://schemas.microsoft.com/office/word/2015/wordml/symex" xmlns:wpg="http://schemas.microsoft.com/office/word/2010/wordprocessingGroup" xmlns:wpi="http://schemas.microsoft.com/office/word/2010/wordprocessingInk" xmlns:wne="http://schemas.microsoft.com/office/word/2006/wordml" xmlns:wps="http://schemas.microsoft.com/office/word/2010/wordprocessingShape" mc:Ignorable="w14 w15 w16se w16cid w16 w16cex w16sdtdh w16sdtfl w16du wp14">
   <w:abstractNum w:abstractNumId="0" w15:restartNumberingAfterBreak="0">
-    <w:nsid w:val="31BF2006"/>
+    <w:nsid w:val="0800228C"/>
     <w:multiLevelType w:val="hybridMultilevel"/>
-    <w:tmpl w:val="D1901C52"/>
-    <w:lvl w:ilvl="0" w:tplc="BB183F7E">
+    <w:tmpl w:val="BC12B2DE"/>
+    <w:lvl w:ilvl="0" w:tplc="91584410">
       <w:start w:val="1"/>
       <w:numFmt w:val="bullet"/>
       <w:lvlText w:val="●"/>
@@ -30624,7 +30624,7 @@
         <w:ind w:left="720" w:hanging="360"/>
       </w:pPr>
     </w:lvl>
-    <w:lvl w:ilvl="1" w:tplc="1A3E3C6C">
+    <w:lvl w:ilvl="1" w:tplc="83C2212A">
       <w:start w:val="1"/>
       <w:numFmt w:val="bullet"/>
       <w:lvlText w:val="○"/>
@@ -30633,7 +30633,7 @@
         <w:ind w:left="1440" w:hanging="360"/>
       </w:pPr>
     </w:lvl>
-    <w:lvl w:ilvl="2" w:tplc="4AC4D098">
+    <w:lvl w:ilvl="2" w:tplc="B2B69F62">
       <w:start w:val="1"/>
       <w:numFmt w:val="bullet"/>
       <w:lvlText w:val="■"/>
@@ -30642,7 +30642,7 @@
         <w:ind w:left="2160" w:hanging="360"/>
       </w:pPr>
     </w:lvl>
-    <w:lvl w:ilvl="3" w:tplc="FF946812">
+    <w:lvl w:ilvl="3" w:tplc="F4D88A2A">
       <w:start w:val="1"/>
       <w:numFmt w:val="bullet"/>
       <w:lvlText w:val="●"/>
@@ -30651,7 +30651,7 @@
         <w:ind w:left="2880" w:hanging="360"/>
       </w:pPr>
     </w:lvl>
-    <w:lvl w:ilvl="4" w:tplc="D696D25A">
+    <w:lvl w:ilvl="4" w:tplc="EE4EA9AC">
       <w:start w:val="1"/>
       <w:numFmt w:val="bullet"/>
       <w:lvlText w:val="○"/>
@@ -30660,7 +30660,7 @@
         <w:ind w:left="3600" w:hanging="360"/>
       </w:pPr>
     </w:lvl>
-    <w:lvl w:ilvl="5" w:tplc="7FF07ACC">
+    <w:lvl w:ilvl="5" w:tplc="A6CEAF00">
       <w:start w:val="1"/>
       <w:numFmt w:val="bullet"/>
       <w:lvlText w:val="■"/>
@@ -30669,7 +30669,7 @@
         <w:ind w:left="4320" w:hanging="360"/>
       </w:pPr>
     </w:lvl>
-    <w:lvl w:ilvl="6" w:tplc="6E88E998">
+    <w:lvl w:ilvl="6" w:tplc="428ED4EA">
       <w:start w:val="1"/>
       <w:numFmt w:val="bullet"/>
       <w:lvlText w:val="●"/>
@@ -30678,7 +30678,7 @@
         <w:ind w:left="5040" w:hanging="360"/>
       </w:pPr>
     </w:lvl>
-    <w:lvl w:ilvl="7" w:tplc="1EE48A58">
+    <w:lvl w:ilvl="7" w:tplc="93688426">
       <w:start w:val="1"/>
       <w:numFmt w:val="bullet"/>
       <w:lvlText w:val="●"/>
@@ -30687,7 +30687,7 @@
         <w:ind w:left="5760" w:hanging="360"/>
       </w:pPr>
     </w:lvl>
-    <w:lvl w:ilvl="8" w:tplc="B6321C0A">
+    <w:lvl w:ilvl="8" w:tplc="22CC3C48">
       <w:start w:val="1"/>
       <w:numFmt w:val="bullet"/>
       <w:lvlText w:val="●"/>
@@ -30698,127 +30698,127 @@
     </w:lvl>
   </w:abstractNum>
   <w:abstractNum w:abstractNumId="1" w15:restartNumberingAfterBreak="0">
-    <w:nsid w:val="64457B19"/>
+    <w:nsid w:val="103A2CA6"/>
     <w:multiLevelType w:val="hybridMultilevel"/>
-    <w:tmpl w:val="7066947A"/>
-    <w:lvl w:ilvl="0" w:tplc="8AA8AFAE">
+    <w:tmpl w:val="1A20C630"/>
+    <w:lvl w:ilvl="0" w:tplc="D4405820">
       <w:start w:val="1"/>
-      <w:numFmt w:val="bullet"/>
-      <w:lvlText w:val="•"/>
+      <w:numFmt w:val="decimal"/>
+      <w:lvlText w:val="%1."/>
       <w:lvlJc w:val="left"/>
       <w:pPr>
         <w:ind w:left="720" w:hanging="360"/>
       </w:pPr>
     </w:lvl>
-    <w:lvl w:ilvl="1" w:tplc="142ADF20">
+    <w:lvl w:ilvl="1" w:tplc="2C96F55A">
       <w:numFmt w:val="decimal"/>
       <w:lvlText w:val=""/>
       <w:lvlJc w:val="left"/>
     </w:lvl>
-    <w:lvl w:ilvl="2" w:tplc="65FA8B60">
+    <w:lvl w:ilvl="2" w:tplc="269C74F0">
       <w:numFmt w:val="decimal"/>
       <w:lvlText w:val=""/>
       <w:lvlJc w:val="left"/>
     </w:lvl>
-    <w:lvl w:ilvl="3" w:tplc="8D0EDF82">
+    <w:lvl w:ilvl="3" w:tplc="795C24A2">
       <w:numFmt w:val="decimal"/>
       <w:lvlText w:val=""/>
       <w:lvlJc w:val="left"/>
     </w:lvl>
-    <w:lvl w:ilvl="4" w:tplc="27FE8940">
+    <w:lvl w:ilvl="4" w:tplc="B946241C">
       <w:numFmt w:val="decimal"/>
       <w:lvlText w:val=""/>
       <w:lvlJc w:val="left"/>
     </w:lvl>
-    <w:lvl w:ilvl="5" w:tplc="E5F80B2E">
+    <w:lvl w:ilvl="5" w:tplc="B88C6DF6">
       <w:numFmt w:val="decimal"/>
       <w:lvlText w:val=""/>
       <w:lvlJc w:val="left"/>
     </w:lvl>
-    <w:lvl w:ilvl="6" w:tplc="4CE44B6C">
+    <w:lvl w:ilvl="6" w:tplc="18C820F8">
       <w:numFmt w:val="decimal"/>
       <w:lvlText w:val=""/>
       <w:lvlJc w:val="left"/>
     </w:lvl>
-    <w:lvl w:ilvl="7" w:tplc="F418C8A2">
+    <w:lvl w:ilvl="7" w:tplc="4B52E7AE">
       <w:numFmt w:val="decimal"/>
       <w:lvlText w:val=""/>
       <w:lvlJc w:val="left"/>
     </w:lvl>
-    <w:lvl w:ilvl="8" w:tplc="97BC7C98">
+    <w:lvl w:ilvl="8" w:tplc="8C7AA3E8">
       <w:numFmt w:val="decimal"/>
       <w:lvlText w:val=""/>
       <w:lvlJc w:val="left"/>
     </w:lvl>
   </w:abstractNum>
   <w:abstractNum w:abstractNumId="2" w15:restartNumberingAfterBreak="0">
-    <w:nsid w:val="77A36DE8"/>
+    <w:nsid w:val="615F54AD"/>
     <w:multiLevelType w:val="hybridMultilevel"/>
-    <w:tmpl w:val="68AC16F8"/>
-    <w:lvl w:ilvl="0" w:tplc="97680358">
+    <w:tmpl w:val="5B1467E6"/>
+    <w:lvl w:ilvl="0" w:tplc="5566C37A">
       <w:start w:val="1"/>
-      <w:numFmt w:val="decimal"/>
-      <w:lvlText w:val="%1."/>
+      <w:numFmt w:val="bullet"/>
+      <w:lvlText w:val="•"/>
       <w:lvlJc w:val="left"/>
       <w:pPr>
         <w:ind w:left="720" w:hanging="360"/>
       </w:pPr>
     </w:lvl>
-    <w:lvl w:ilvl="1" w:tplc="8BF6FBD0">
+    <w:lvl w:ilvl="1" w:tplc="901AD24A">
       <w:numFmt w:val="decimal"/>
       <w:lvlText w:val=""/>
       <w:lvlJc w:val="left"/>
     </w:lvl>
-    <w:lvl w:ilvl="2" w:tplc="F9D60AC8">
+    <w:lvl w:ilvl="2" w:tplc="EB6C393E">
       <w:numFmt w:val="decimal"/>
       <w:lvlText w:val=""/>
       <w:lvlJc w:val="left"/>
     </w:lvl>
-    <w:lvl w:ilvl="3" w:tplc="0B227564">
+    <w:lvl w:ilvl="3" w:tplc="7CA0A394">
       <w:numFmt w:val="decimal"/>
       <w:lvlText w:val=""/>
       <w:lvlJc w:val="left"/>
     </w:lvl>
-    <w:lvl w:ilvl="4" w:tplc="194274D0">
+    <w:lvl w:ilvl="4" w:tplc="0986BA78">
       <w:numFmt w:val="decimal"/>
       <w:lvlText w:val=""/>
       <w:lvlJc w:val="left"/>
     </w:lvl>
-    <w:lvl w:ilvl="5" w:tplc="F2AEAA50">
+    <w:lvl w:ilvl="5" w:tplc="2F787C50">
       <w:numFmt w:val="decimal"/>
       <w:lvlText w:val=""/>
       <w:lvlJc w:val="left"/>
     </w:lvl>
-    <w:lvl w:ilvl="6" w:tplc="4D2CF8BE">
+    <w:lvl w:ilvl="6" w:tplc="792E620E">
       <w:numFmt w:val="decimal"/>
       <w:lvlText w:val=""/>
       <w:lvlJc w:val="left"/>
     </w:lvl>
-    <w:lvl w:ilvl="7" w:tplc="465C8FFE">
+    <w:lvl w:ilvl="7" w:tplc="2460DB48">
       <w:numFmt w:val="decimal"/>
       <w:lvlText w:val=""/>
       <w:lvlJc w:val="left"/>
     </w:lvl>
-    <w:lvl w:ilvl="8" w:tplc="AE966400">
+    <w:lvl w:ilvl="8" w:tplc="FD00A8CA">
       <w:numFmt w:val="decimal"/>
       <w:lvlText w:val=""/>
       <w:lvlJc w:val="left"/>
     </w:lvl>
   </w:abstractNum>
-  <w:num w:numId="1" w16cid:durableId="1540507172">
+  <w:num w:numId="1" w16cid:durableId="2012676719">
     <w:abstractNumId w:val="0"/>
     <w:lvlOverride w:ilvl="0">
       <w:startOverride w:val="1"/>
     </w:lvlOverride>
   </w:num>
-  <w:num w:numId="2" w16cid:durableId="122575755">
-    <w:abstractNumId w:val="2"/>
+  <w:num w:numId="2" w16cid:durableId="1519588256">
+    <w:abstractNumId w:val="1"/>
     <w:lvlOverride w:ilvl="0">
       <w:startOverride w:val="1"/>
     </w:lvlOverride>
   </w:num>
-  <w:num w:numId="3" w16cid:durableId="1076316909">
-    <w:abstractNumId w:val="1"/>
+  <w:num w:numId="3" w16cid:durableId="676465919">
+    <w:abstractNumId w:val="2"/>
     <w:lvlOverride w:ilvl="0">
       <w:startOverride w:val="1"/>
     </w:lvlOverride>
@@ -31429,7 +31429,7 @@
     <w:autoRedefine/>
     <w:uiPriority w:val="39"/>
     <w:unhideWhenUsed/>
-    <w:rsid w:val="00DA2883"/>
+    <w:rsid w:val="002A56D8"/>
     <w:pPr>
       <w:spacing w:after="100"/>
     </w:pPr>
@@ -31445,7 +31445,7 @@
     <w:autoRedefine/>
     <w:uiPriority w:val="39"/>
     <w:unhideWhenUsed/>
-    <w:rsid w:val="00DA2883"/>
+    <w:rsid w:val="002A56D8"/>
     <w:pPr>
       <w:spacing w:after="100"/>
       <w:ind w:left="220"/>
@@ -31462,7 +31462,7 @@
     <w:autoRedefine/>
     <w:uiPriority w:val="39"/>
     <w:unhideWhenUsed/>
-    <w:rsid w:val="00DA2883"/>
+    <w:rsid w:val="002A56D8"/>
     <w:pPr>
       <w:spacing w:after="100"/>
       <w:ind w:left="440"/>
@@ -31479,7 +31479,7 @@
     <w:autoRedefine/>
     <w:uiPriority w:val="39"/>
     <w:unhideWhenUsed/>
-    <w:rsid w:val="00DA2883"/>
+    <w:rsid w:val="002A56D8"/>
     <w:pPr>
       <w:spacing w:after="100" w:line="278" w:lineRule="auto"/>
       <w:ind w:left="720"/>
@@ -31499,7 +31499,7 @@
     <w:autoRedefine/>
     <w:uiPriority w:val="39"/>
     <w:unhideWhenUsed/>
-    <w:rsid w:val="00DA2883"/>
+    <w:rsid w:val="002A56D8"/>
     <w:pPr>
       <w:spacing w:after="100" w:line="278" w:lineRule="auto"/>
       <w:ind w:left="960"/>
@@ -31519,7 +31519,7 @@
     <w:autoRedefine/>
     <w:uiPriority w:val="39"/>
     <w:unhideWhenUsed/>
-    <w:rsid w:val="00DA2883"/>
+    <w:rsid w:val="002A56D8"/>
     <w:pPr>
       <w:spacing w:after="100" w:line="278" w:lineRule="auto"/>
       <w:ind w:left="1200"/>
@@ -31539,7 +31539,7 @@
     <w:autoRedefine/>
     <w:uiPriority w:val="39"/>
     <w:unhideWhenUsed/>
-    <w:rsid w:val="00DA2883"/>
+    <w:rsid w:val="002A56D8"/>
     <w:pPr>
       <w:spacing w:after="100" w:line="278" w:lineRule="auto"/>
       <w:ind w:left="1440"/>
@@ -31559,7 +31559,7 @@
     <w:autoRedefine/>
     <w:uiPriority w:val="39"/>
     <w:unhideWhenUsed/>
-    <w:rsid w:val="00DA2883"/>
+    <w:rsid w:val="002A56D8"/>
     <w:pPr>
       <w:spacing w:after="100" w:line="278" w:lineRule="auto"/>
       <w:ind w:left="1680"/>
@@ -31579,7 +31579,7 @@
     <w:autoRedefine/>
     <w:uiPriority w:val="39"/>
     <w:unhideWhenUsed/>
-    <w:rsid w:val="00DA2883"/>
+    <w:rsid w:val="002A56D8"/>
     <w:pPr>
       <w:spacing w:after="100" w:line="278" w:lineRule="auto"/>
       <w:ind w:left="1920"/>
@@ -31598,7 +31598,7 @@
     <w:uiPriority w:val="99"/>
     <w:semiHidden/>
     <w:unhideWhenUsed/>
-    <w:rsid w:val="00DA2883"/>
+    <w:rsid w:val="002A56D8"/>
     <w:rPr>
       <w:color w:val="605E5C"/>
       <w:shd w:val="clear" w:color="auto" w:fill="E1DFDD"/>
@@ -31610,7 +31610,7 @@
     <w:link w:val="HeaderChar"/>
     <w:uiPriority w:val="99"/>
     <w:unhideWhenUsed/>
-    <w:rsid w:val="00DA2883"/>
+    <w:rsid w:val="002A56D8"/>
     <w:pPr>
       <w:tabs>
         <w:tab w:val="center" w:pos="4513"/>
@@ -31627,7 +31627,7 @@
     <w:basedOn w:val="DefaultParagraphFont"/>
     <w:link w:val="Header"/>
     <w:uiPriority w:val="99"/>
-    <w:rsid w:val="00DA2883"/>
+    <w:rsid w:val="002A56D8"/>
     <w:rPr>
       <w:rFonts w:cs="Cordia New"/>
       <w:szCs w:val="28"/>
@@ -31639,7 +31639,7 @@
     <w:link w:val="FooterChar"/>
     <w:uiPriority w:val="99"/>
     <w:unhideWhenUsed/>
-    <w:rsid w:val="00DA2883"/>
+    <w:rsid w:val="002A56D8"/>
     <w:pPr>
       <w:tabs>
         <w:tab w:val="center" w:pos="4513"/>
@@ -31656,7 +31656,7 @@
     <w:basedOn w:val="DefaultParagraphFont"/>
     <w:link w:val="Footer"/>
     <w:uiPriority w:val="99"/>
-    <w:rsid w:val="00DA2883"/>
+    <w:rsid w:val="002A56D8"/>
     <w:rPr>
       <w:rFonts w:cs="Cordia New"/>
       <w:szCs w:val="28"/>

</xml_diff>